<commit_message>
fix: JLAU template body format + keywords + H2/H3 headings
- Fix body text using wrong sample (table caption instead of body text)
  Root cause: Step 5 cleared all body paragraphs including the format sample
  Fix: preserve p[90] (correct body format: indent=342900, 宋体, 小四号)
- Create proper H2 heading (四号黑体居左) and H3 heading (小四号宋体居左)
  via XML construction instead of deepcopy from wrong source
- Fix keywords_zh/en from array to semicolon-separated string
- Body paragraphs now correctly inherit: 小四号宋体, 首行缩进2字符

Co-Authored-By: Claude Opus 4.6 (1M context) <noreply@anthropic.com>
</commit_message>
<xml_diff>
--- a/templates/jlau/template.docx
+++ b/templates/jlau/template.docx
@@ -8051,237 +8051,315 @@
     </w:p>
     <w:p>
       <w:pPr>
-        <w:autoSpaceDE w:val="0"/>
-        <w:autoSpaceDN w:val="0"/>
-        <w:adjustRightInd w:val="0"/>
-        <w:spacing w:line="300" w:lineRule="auto"/>
-        <w:ind w:left="2520" w:firstLine="1054" w:firstLineChars="500"/>
-        <w:jc w:val="both"/>
-        <w:rPr>
-          <w:rFonts w:hint="default" w:ascii="宋体" w:hAnsi="宋体" w:eastAsia="宋体"/>
-          <w:kern w:val="0"/>
-          <w:lang w:val="en-US" w:eastAsia="zh-CN"/>
-        </w:rPr>
-      </w:pPr>
+        <w:jc w:val="left"/>
+        <w:spacing w:line="400" w:lineRule="exact"/>
+      </w:pPr>
+      <w:r>
+        <w:rPr>
+          <w:rFonts w:eastAsia="黑体" w:ascii="黑体" w:hAnsi="黑体"/>
+          <w:sz w:val="28"/>
+          <w:szCs w:val="28"/>
+        </w:rPr>
+        <w:t xml:space="preserve">{{ sec.title }}</w:t>
+      </w:r>
+    </w:p>
+    <w:p>
+      <w:r>
+        <w:t xml:space="preserve">{%p for para in sec.content %}</w:t>
+      </w:r>
+    </w:p>
+    <w:p>
+      <w:pPr>
+        <w:snapToGrid w:val="0"/>
+        <w:spacing w:line="400" w:lineRule="exact"/>
+        <w:ind w:firstLine="540" w:firstLineChars="225"/>
+        <w:rPr>
+          <w:rFonts w:ascii="宋体" w:hAnsi="宋体"/>
+          <w:sz w:val="24"/>
+        </w:rPr>
+      </w:pPr>
+      <w:r>
+        <w:rPr>
+          <w:rFonts w:ascii="宋体" w:hAnsi="宋体"/>
+          <w:sz w:val="24"/>
+        </w:rPr>
+        <w:t>{{ para }}</w:t>
+      </w:r>
       <w:r>
         <w:rPr>
           <w:rFonts w:hint="eastAsia" w:ascii="宋体" w:hAnsi="宋体"/>
-          <w:b/>
-          <w:bCs/>
-          <w:kern w:val="0"/>
-          <w:szCs w:val="18"/>
-        </w:rPr>
-        <w:t>{{ sec.title }}</w:t>
+          <w:sz w:val="24"/>
+        </w:rPr>
+      </w:r>
+      <w:r>
+        <w:rPr>
+          <w:rFonts w:ascii="宋体" w:hAnsi="宋体"/>
+          <w:sz w:val="24"/>
+        </w:rPr>
       </w:r>
       <w:r>
         <w:rPr>
           <w:rFonts w:hint="eastAsia" w:ascii="宋体" w:hAnsi="宋体"/>
-          <w:b/>
-          <w:bCs/>
-          <w:kern w:val="0"/>
-          <w:szCs w:val="18"/>
-          <w:lang w:val="en-US" w:eastAsia="zh-CN"/>
+          <w:sz w:val="24"/>
+        </w:rPr>
+      </w:r>
+      <w:r>
+        <w:rPr>
+          <w:rFonts w:ascii="宋体" w:hAnsi="宋体"/>
+          <w:sz w:val="24"/>
+        </w:rPr>
+      </w:r>
+      <w:r>
+        <w:rPr>
+          <w:rFonts w:ascii="宋体" w:hAnsi="宋体"/>
+          <w:color w:val="FF0000"/>
+          <w:sz w:val="24"/>
+        </w:rPr>
+      </w:r>
+      <w:r>
+        <w:rPr>
+          <w:rFonts w:ascii="宋体" w:hAnsi="宋体"/>
+          <w:sz w:val="24"/>
+        </w:rPr>
+      </w:r>
+      <w:r>
+        <w:rPr>
+          <w:rFonts w:ascii="宋体" w:hAnsi="宋体"/>
+          <w:color w:val="FF0000"/>
+          <w:sz w:val="24"/>
+        </w:rPr>
+      </w:r>
+      <w:r>
+        <w:rPr>
+          <w:rFonts w:ascii="宋体" w:hAnsi="宋体"/>
+          <w:sz w:val="24"/>
+        </w:rPr>
+      </w:r>
+      <w:r>
+        <w:rPr>
+          <w:rFonts w:ascii="宋体" w:hAnsi="宋体"/>
+          <w:color w:val="FF0000"/>
+          <w:sz w:val="24"/>
+        </w:rPr>
+      </w:r>
+      <w:r>
+        <w:rPr>
+          <w:rFonts w:ascii="宋体" w:hAnsi="宋体"/>
+          <w:sz w:val="24"/>
+        </w:rPr>
+      </w:r>
+      <w:r>
+        <w:rPr>
+          <w:rFonts w:ascii="宋体" w:hAnsi="宋体"/>
+          <w:color w:val="FF0000"/>
+          <w:sz w:val="24"/>
+        </w:rPr>
+      </w:r>
+      <w:r>
+        <w:rPr>
+          <w:rFonts w:ascii="宋体" w:hAnsi="宋体"/>
+          <w:sz w:val="24"/>
+        </w:rPr>
+      </w:r>
+      <w:r>
+        <w:rPr>
+          <w:rFonts w:ascii="宋体" w:hAnsi="宋体"/>
+          <w:color w:val="FF0000"/>
+          <w:sz w:val="24"/>
+        </w:rPr>
+      </w:r>
+      <w:r>
+        <w:rPr>
+          <w:rFonts w:ascii="宋体" w:hAnsi="宋体"/>
+          <w:sz w:val="24"/>
         </w:rPr>
       </w:r>
       <w:r>
         <w:rPr>
           <w:rFonts w:hint="eastAsia" w:ascii="宋体" w:hAnsi="宋体"/>
-          <w:b/>
-          <w:bCs/>
-          <w:kern w:val="0"/>
-          <w:szCs w:val="18"/>
-        </w:rPr>
+          <w:sz w:val="24"/>
+          <w:lang w:val="en-US" w:eastAsia="zh-CN"/>
+        </w:rPr>
+      </w:r>
+      <w:r>
+        <w:rPr>
+          <w:rFonts w:ascii="宋体" w:hAnsi="宋体"/>
+          <w:sz w:val="24"/>
+        </w:rPr>
+      </w:r>
+      <w:r>
+        <w:rPr>
+          <w:rFonts w:ascii="宋体" w:hAnsi="宋体"/>
+          <w:color w:val="FF0000"/>
+          <w:sz w:val="24"/>
+        </w:rPr>
+      </w:r>
+      <w:r>
+        <w:rPr>
+          <w:rFonts w:ascii="宋体" w:hAnsi="宋体"/>
+          <w:sz w:val="24"/>
+        </w:rPr>
+      </w:r>
+    </w:p>
+    <w:p>
+      <w:r>
+        <w:t xml:space="preserve">{%p endfor %}</w:t>
+      </w:r>
+    </w:p>
+    <w:p>
+      <w:r>
+        <w:t xml:space="preserve">{%p for sub in sec.subsections %}</w:t>
+      </w:r>
+    </w:p>
+    <w:p>
+      <w:pPr>
+        <w:jc w:val="left"/>
+        <w:spacing w:line="400" w:lineRule="exact"/>
+      </w:pPr>
+      <w:r>
+        <w:rPr>
+          <w:rFonts w:eastAsia="宋体" w:ascii="宋体" w:hAnsi="宋体"/>
+          <w:sz w:val="24"/>
+          <w:szCs w:val="24"/>
+        </w:rPr>
+        <w:t xml:space="preserve">{{ sub.title }}</w:t>
+      </w:r>
+    </w:p>
+    <w:p>
+      <w:r>
+        <w:t xml:space="preserve">{%p for p2 in sub.content %}</w:t>
+      </w:r>
+    </w:p>
+    <w:p>
+      <w:pPr>
+        <w:snapToGrid w:val="0"/>
+        <w:spacing w:line="400" w:lineRule="exact"/>
+        <w:ind w:firstLine="540" w:firstLineChars="225"/>
+        <w:rPr>
+          <w:rFonts w:ascii="宋体" w:hAnsi="宋体"/>
+          <w:sz w:val="24"/>
+        </w:rPr>
+      </w:pPr>
+      <w:r>
+        <w:rPr>
+          <w:rFonts w:ascii="宋体" w:hAnsi="宋体"/>
+          <w:sz w:val="24"/>
+        </w:rPr>
+        <w:t>{{ p2 }}</w:t>
       </w:r>
       <w:r>
         <w:rPr>
           <w:rFonts w:hint="eastAsia" w:ascii="宋体" w:hAnsi="宋体"/>
-          <w:b/>
-          <w:bCs/>
-          <w:kern w:val="0"/>
-          <w:szCs w:val="18"/>
-          <w:lang w:val="en-US" w:eastAsia="zh-CN"/>
-        </w:rPr>
-      </w:r>
-    </w:p>
-    <w:p>
-      <w:r>
-        <w:t xml:space="preserve">{%p for para in sec.content %}</w:t>
-      </w:r>
-    </w:p>
-    <w:p>
-      <w:pPr>
-        <w:autoSpaceDE w:val="0"/>
-        <w:autoSpaceDN w:val="0"/>
-        <w:adjustRightInd w:val="0"/>
-        <w:spacing w:line="300" w:lineRule="auto"/>
-        <w:ind w:left="2520" w:firstLine="1054" w:firstLineChars="500"/>
-        <w:jc w:val="both"/>
-        <w:rPr>
-          <w:rFonts w:hint="default" w:ascii="宋体" w:hAnsi="宋体" w:eastAsia="宋体"/>
-          <w:kern w:val="0"/>
-          <w:lang w:val="en-US" w:eastAsia="zh-CN"/>
-        </w:rPr>
-      </w:pPr>
+          <w:sz w:val="24"/>
+        </w:rPr>
+      </w:r>
+      <w:r>
+        <w:rPr>
+          <w:rFonts w:ascii="宋体" w:hAnsi="宋体"/>
+          <w:sz w:val="24"/>
+        </w:rPr>
+      </w:r>
       <w:r>
         <w:rPr>
           <w:rFonts w:hint="eastAsia" w:ascii="宋体" w:hAnsi="宋体"/>
-          <w:b/>
-          <w:bCs/>
-          <w:kern w:val="0"/>
-          <w:szCs w:val="18"/>
-        </w:rPr>
-        <w:t>{{ para }}</w:t>
+          <w:sz w:val="24"/>
+        </w:rPr>
+      </w:r>
+      <w:r>
+        <w:rPr>
+          <w:rFonts w:ascii="宋体" w:hAnsi="宋体"/>
+          <w:sz w:val="24"/>
+        </w:rPr>
+      </w:r>
+      <w:r>
+        <w:rPr>
+          <w:rFonts w:ascii="宋体" w:hAnsi="宋体"/>
+          <w:color w:val="FF0000"/>
+          <w:sz w:val="24"/>
+        </w:rPr>
+      </w:r>
+      <w:r>
+        <w:rPr>
+          <w:rFonts w:ascii="宋体" w:hAnsi="宋体"/>
+          <w:sz w:val="24"/>
+        </w:rPr>
+      </w:r>
+      <w:r>
+        <w:rPr>
+          <w:rFonts w:ascii="宋体" w:hAnsi="宋体"/>
+          <w:color w:val="FF0000"/>
+          <w:sz w:val="24"/>
+        </w:rPr>
+      </w:r>
+      <w:r>
+        <w:rPr>
+          <w:rFonts w:ascii="宋体" w:hAnsi="宋体"/>
+          <w:sz w:val="24"/>
+        </w:rPr>
+      </w:r>
+      <w:r>
+        <w:rPr>
+          <w:rFonts w:ascii="宋体" w:hAnsi="宋体"/>
+          <w:color w:val="FF0000"/>
+          <w:sz w:val="24"/>
+        </w:rPr>
+      </w:r>
+      <w:r>
+        <w:rPr>
+          <w:rFonts w:ascii="宋体" w:hAnsi="宋体"/>
+          <w:sz w:val="24"/>
+        </w:rPr>
+      </w:r>
+      <w:r>
+        <w:rPr>
+          <w:rFonts w:ascii="宋体" w:hAnsi="宋体"/>
+          <w:color w:val="FF0000"/>
+          <w:sz w:val="24"/>
+        </w:rPr>
+      </w:r>
+      <w:r>
+        <w:rPr>
+          <w:rFonts w:ascii="宋体" w:hAnsi="宋体"/>
+          <w:sz w:val="24"/>
+        </w:rPr>
+      </w:r>
+      <w:r>
+        <w:rPr>
+          <w:rFonts w:ascii="宋体" w:hAnsi="宋体"/>
+          <w:color w:val="FF0000"/>
+          <w:sz w:val="24"/>
+        </w:rPr>
+      </w:r>
+      <w:r>
+        <w:rPr>
+          <w:rFonts w:ascii="宋体" w:hAnsi="宋体"/>
+          <w:sz w:val="24"/>
+        </w:rPr>
       </w:r>
       <w:r>
         <w:rPr>
           <w:rFonts w:hint="eastAsia" w:ascii="宋体" w:hAnsi="宋体"/>
-          <w:b/>
-          <w:bCs/>
-          <w:kern w:val="0"/>
-          <w:szCs w:val="18"/>
-          <w:lang w:val="en-US" w:eastAsia="zh-CN"/>
-        </w:rPr>
-      </w:r>
-      <w:r>
-        <w:rPr>
-          <w:rFonts w:hint="eastAsia" w:ascii="宋体" w:hAnsi="宋体"/>
-          <w:b/>
-          <w:bCs/>
-          <w:kern w:val="0"/>
-          <w:szCs w:val="18"/>
-        </w:rPr>
-      </w:r>
-      <w:r>
-        <w:rPr>
-          <w:rFonts w:hint="eastAsia" w:ascii="宋体" w:hAnsi="宋体"/>
-          <w:b/>
-          <w:bCs/>
-          <w:kern w:val="0"/>
-          <w:szCs w:val="18"/>
-          <w:lang w:val="en-US" w:eastAsia="zh-CN"/>
-        </w:rPr>
-      </w:r>
-    </w:p>
-    <w:p>
-      <w:r>
-        <w:t xml:space="preserve">{%p endfor %}</w:t>
-      </w:r>
-    </w:p>
-    <w:p>
-      <w:r>
-        <w:t xml:space="preserve">{%p for sub in sec.subsections %}</w:t>
-      </w:r>
-    </w:p>
-    <w:p>
-      <w:pPr>
-        <w:autoSpaceDE w:val="0"/>
-        <w:autoSpaceDN w:val="0"/>
-        <w:adjustRightInd w:val="0"/>
-        <w:spacing w:line="300" w:lineRule="auto"/>
-        <w:ind w:left="2520" w:firstLine="1054" w:firstLineChars="500"/>
-        <w:jc w:val="both"/>
-        <w:rPr>
-          <w:rFonts w:hint="default" w:ascii="宋体" w:hAnsi="宋体" w:eastAsia="宋体"/>
-          <w:kern w:val="0"/>
-          <w:lang w:val="en-US" w:eastAsia="zh-CN"/>
-        </w:rPr>
-      </w:pPr>
-      <w:r>
-        <w:rPr>
-          <w:rFonts w:hint="eastAsia" w:ascii="宋体" w:hAnsi="宋体"/>
-          <w:b/>
-          <w:bCs/>
-          <w:kern w:val="0"/>
-          <w:szCs w:val="18"/>
-        </w:rPr>
-        <w:t>{{ sub.title }}</w:t>
-      </w:r>
-      <w:r>
-        <w:rPr>
-          <w:rFonts w:hint="eastAsia" w:ascii="宋体" w:hAnsi="宋体"/>
-          <w:b/>
-          <w:bCs/>
-          <w:kern w:val="0"/>
-          <w:szCs w:val="18"/>
-          <w:lang w:val="en-US" w:eastAsia="zh-CN"/>
-        </w:rPr>
-      </w:r>
-      <w:r>
-        <w:rPr>
-          <w:rFonts w:hint="eastAsia" w:ascii="宋体" w:hAnsi="宋体"/>
-          <w:b/>
-          <w:bCs/>
-          <w:kern w:val="0"/>
-          <w:szCs w:val="18"/>
-        </w:rPr>
-      </w:r>
-      <w:r>
-        <w:rPr>
-          <w:rFonts w:hint="eastAsia" w:ascii="宋体" w:hAnsi="宋体"/>
-          <w:b/>
-          <w:bCs/>
-          <w:kern w:val="0"/>
-          <w:szCs w:val="18"/>
-          <w:lang w:val="en-US" w:eastAsia="zh-CN"/>
-        </w:rPr>
-      </w:r>
-    </w:p>
-    <w:p>
-      <w:r>
-        <w:t xml:space="preserve">{%p for p2 in sub.content %}</w:t>
-      </w:r>
-    </w:p>
-    <w:p>
-      <w:pPr>
-        <w:autoSpaceDE w:val="0"/>
-        <w:autoSpaceDN w:val="0"/>
-        <w:adjustRightInd w:val="0"/>
-        <w:spacing w:line="300" w:lineRule="auto"/>
-        <w:ind w:left="2520" w:firstLine="1054" w:firstLineChars="500"/>
-        <w:jc w:val="both"/>
-        <w:rPr>
-          <w:rFonts w:hint="default" w:ascii="宋体" w:hAnsi="宋体" w:eastAsia="宋体"/>
-          <w:kern w:val="0"/>
-          <w:lang w:val="en-US" w:eastAsia="zh-CN"/>
-        </w:rPr>
-      </w:pPr>
-      <w:r>
-        <w:rPr>
-          <w:rFonts w:hint="eastAsia" w:ascii="宋体" w:hAnsi="宋体"/>
-          <w:b/>
-          <w:bCs/>
-          <w:kern w:val="0"/>
-          <w:szCs w:val="18"/>
-        </w:rPr>
-        <w:t>{{ p2 }}</w:t>
-      </w:r>
-      <w:r>
-        <w:rPr>
-          <w:rFonts w:hint="eastAsia" w:ascii="宋体" w:hAnsi="宋体"/>
-          <w:b/>
-          <w:bCs/>
-          <w:kern w:val="0"/>
-          <w:szCs w:val="18"/>
-          <w:lang w:val="en-US" w:eastAsia="zh-CN"/>
-        </w:rPr>
-      </w:r>
-      <w:r>
-        <w:rPr>
-          <w:rFonts w:hint="eastAsia" w:ascii="宋体" w:hAnsi="宋体"/>
-          <w:b/>
-          <w:bCs/>
-          <w:kern w:val="0"/>
-          <w:szCs w:val="18"/>
-        </w:rPr>
-      </w:r>
-      <w:r>
-        <w:rPr>
-          <w:rFonts w:hint="eastAsia" w:ascii="宋体" w:hAnsi="宋体"/>
-          <w:b/>
-          <w:bCs/>
-          <w:kern w:val="0"/>
-          <w:szCs w:val="18"/>
-          <w:lang w:val="en-US" w:eastAsia="zh-CN"/>
+          <w:sz w:val="24"/>
+          <w:lang w:val="en-US" w:eastAsia="zh-CN"/>
+        </w:rPr>
+      </w:r>
+      <w:r>
+        <w:rPr>
+          <w:rFonts w:ascii="宋体" w:hAnsi="宋体"/>
+          <w:sz w:val="24"/>
+        </w:rPr>
+      </w:r>
+      <w:r>
+        <w:rPr>
+          <w:rFonts w:ascii="宋体" w:hAnsi="宋体"/>
+          <w:color w:val="FF0000"/>
+          <w:sz w:val="24"/>
+        </w:rPr>
+      </w:r>
+      <w:r>
+        <w:rPr>
+          <w:rFonts w:ascii="宋体" w:hAnsi="宋体"/>
+          <w:sz w:val="24"/>
         </w:rPr>
       </w:r>
     </w:p>
@@ -8332,138 +8410,6 @@
         <w:spacing w:line="400" w:lineRule="exact"/>
         <w:ind w:firstLine="540" w:firstLineChars="225"/>
         <w:rPr>
-          <w:rFonts w:ascii="宋体" w:hAnsi="宋体"/>
-          <w:sz w:val="24"/>
-        </w:rPr>
-      </w:pPr>
-      <w:r>
-        <w:rPr>
-          <w:rFonts w:ascii="宋体" w:hAnsi="宋体"/>
-          <w:sz w:val="24"/>
-        </w:rPr>
-      </w:r>
-      <w:r>
-        <w:rPr>
-          <w:rFonts w:hint="eastAsia" w:ascii="宋体" w:hAnsi="宋体"/>
-          <w:sz w:val="24"/>
-        </w:rPr>
-      </w:r>
-      <w:r>
-        <w:rPr>
-          <w:rFonts w:ascii="宋体" w:hAnsi="宋体"/>
-          <w:sz w:val="24"/>
-        </w:rPr>
-      </w:r>
-      <w:r>
-        <w:rPr>
-          <w:rFonts w:hint="eastAsia" w:ascii="宋体" w:hAnsi="宋体"/>
-          <w:sz w:val="24"/>
-        </w:rPr>
-      </w:r>
-      <w:r>
-        <w:rPr>
-          <w:rFonts w:ascii="宋体" w:hAnsi="宋体"/>
-          <w:sz w:val="24"/>
-        </w:rPr>
-      </w:r>
-      <w:r>
-        <w:rPr>
-          <w:rFonts w:ascii="宋体" w:hAnsi="宋体"/>
-          <w:color w:val="FF0000"/>
-          <w:sz w:val="24"/>
-        </w:rPr>
-      </w:r>
-      <w:r>
-        <w:rPr>
-          <w:rFonts w:ascii="宋体" w:hAnsi="宋体"/>
-          <w:sz w:val="24"/>
-        </w:rPr>
-      </w:r>
-      <w:r>
-        <w:rPr>
-          <w:rFonts w:ascii="宋体" w:hAnsi="宋体"/>
-          <w:color w:val="FF0000"/>
-          <w:sz w:val="24"/>
-        </w:rPr>
-      </w:r>
-      <w:r>
-        <w:rPr>
-          <w:rFonts w:ascii="宋体" w:hAnsi="宋体"/>
-          <w:sz w:val="24"/>
-        </w:rPr>
-      </w:r>
-      <w:r>
-        <w:rPr>
-          <w:rFonts w:ascii="宋体" w:hAnsi="宋体"/>
-          <w:color w:val="FF0000"/>
-          <w:sz w:val="24"/>
-        </w:rPr>
-      </w:r>
-      <w:r>
-        <w:rPr>
-          <w:rFonts w:ascii="宋体" w:hAnsi="宋体"/>
-          <w:sz w:val="24"/>
-        </w:rPr>
-      </w:r>
-      <w:r>
-        <w:rPr>
-          <w:rFonts w:ascii="宋体" w:hAnsi="宋体"/>
-          <w:color w:val="FF0000"/>
-          <w:sz w:val="24"/>
-        </w:rPr>
-      </w:r>
-      <w:r>
-        <w:rPr>
-          <w:rFonts w:ascii="宋体" w:hAnsi="宋体"/>
-          <w:sz w:val="24"/>
-        </w:rPr>
-      </w:r>
-      <w:r>
-        <w:rPr>
-          <w:rFonts w:ascii="宋体" w:hAnsi="宋体"/>
-          <w:color w:val="FF0000"/>
-          <w:sz w:val="24"/>
-        </w:rPr>
-      </w:r>
-      <w:r>
-        <w:rPr>
-          <w:rFonts w:ascii="宋体" w:hAnsi="宋体"/>
-          <w:sz w:val="24"/>
-        </w:rPr>
-      </w:r>
-      <w:r>
-        <w:rPr>
-          <w:rFonts w:hint="eastAsia" w:ascii="宋体" w:hAnsi="宋体"/>
-          <w:sz w:val="24"/>
-          <w:lang w:val="en-US" w:eastAsia="zh-CN"/>
-        </w:rPr>
-      </w:r>
-      <w:r>
-        <w:rPr>
-          <w:rFonts w:ascii="宋体" w:hAnsi="宋体"/>
-          <w:sz w:val="24"/>
-        </w:rPr>
-      </w:r>
-      <w:r>
-        <w:rPr>
-          <w:rFonts w:ascii="宋体" w:hAnsi="宋体"/>
-          <w:color w:val="FF0000"/>
-          <w:sz w:val="24"/>
-        </w:rPr>
-      </w:r>
-      <w:r>
-        <w:rPr>
-          <w:rFonts w:ascii="宋体" w:hAnsi="宋体"/>
-          <w:sz w:val="24"/>
-        </w:rPr>
-      </w:r>
-    </w:p>
-    <w:p>
-      <w:pPr>
-        <w:snapToGrid w:val="0"/>
-        <w:spacing w:line="400" w:lineRule="exact"/>
-        <w:ind w:firstLine="540" w:firstLineChars="225"/>
-        <w:rPr>
           <w:sz w:val="24"/>
         </w:rPr>
       </w:pPr>
@@ -9516,6 +9462,59 @@
           <w:lang w:val="en-US" w:eastAsia="zh-CN"/>
         </w:rPr>
       </w:pPr>
+    </w:p>
+    <w:p>
+      <w:pPr>
+        <w:autoSpaceDE w:val="0"/>
+        <w:autoSpaceDN w:val="0"/>
+        <w:adjustRightInd w:val="0"/>
+        <w:spacing w:line="300" w:lineRule="auto"/>
+        <w:ind w:left="2520" w:firstLine="1054" w:firstLineChars="500"/>
+        <w:jc w:val="both"/>
+        <w:rPr>
+          <w:rFonts w:hint="default" w:ascii="宋体" w:hAnsi="宋体" w:eastAsia="宋体"/>
+          <w:kern w:val="0"/>
+          <w:lang w:val="en-US" w:eastAsia="zh-CN"/>
+        </w:rPr>
+      </w:pPr>
+      <w:r>
+        <w:rPr>
+          <w:rFonts w:hint="eastAsia" w:ascii="宋体" w:hAnsi="宋体"/>
+          <w:b/>
+          <w:bCs/>
+          <w:kern w:val="0"/>
+          <w:szCs w:val="18"/>
+        </w:rPr>
+      </w:r>
+      <w:r>
+        <w:rPr>
+          <w:rFonts w:hint="eastAsia" w:ascii="宋体" w:hAnsi="宋体"/>
+          <w:b/>
+          <w:bCs/>
+          <w:kern w:val="0"/>
+          <w:szCs w:val="18"/>
+          <w:lang w:val="en-US" w:eastAsia="zh-CN"/>
+        </w:rPr>
+      </w:r>
+      <w:r>
+        <w:rPr>
+          <w:rFonts w:hint="eastAsia" w:ascii="宋体" w:hAnsi="宋体"/>
+          <w:b/>
+          <w:bCs/>
+          <w:kern w:val="0"/>
+          <w:szCs w:val="18"/>
+        </w:rPr>
+      </w:r>
+      <w:r>
+        <w:rPr>
+          <w:rFonts w:hint="eastAsia" w:ascii="宋体" w:hAnsi="宋体"/>
+          <w:b/>
+          <w:bCs/>
+          <w:kern w:val="0"/>
+          <w:szCs w:val="18"/>
+          <w:lang w:val="en-US" w:eastAsia="zh-CN"/>
+        </w:rPr>
+      </w:r>
     </w:p>
     <w:p>
       <w:pPr>

</xml_diff>

<commit_message>
fix: JLAU template bracket cleanup + image sizing + abstract spacing
- Remove leftover brackets from 摘要/ABSTRACT/目录 headings
- Compress empty paragraph spacing in abstract area
- Update image widths: use case/flow 130mm, architecture/ER 140mm
- Fix keywords format from array to semicolon-separated string

Co-Authored-By: Claude Opus 4.6 (1M context) <noreply@anthropic.com>
</commit_message>
<xml_diff>
--- a/templates/jlau/template.docx
+++ b/templates/jlau/template.docx
@@ -917,7 +917,7 @@
     <w:p>
       <w:pPr>
         <w:pStyle w:val="11"/>
-        <w:spacing w:before="120" w:beforeLines="50" w:after="120" w:afterLines="50" w:line="240" w:lineRule="auto"/>
+        <w:spacing w:before="0" w:beforeLines="50" w:after="0" w:afterLines="50" w:line="20" w:lineRule="exact"/>
         <w:ind w:left="400" w:firstLine="0"/>
         <w:rPr>
           <w:color w:val="0000FF"/>
@@ -932,6 +932,33 @@
           <w:docGrid w:linePitch="312" w:charSpace="0"/>
         </w:sectPr>
       </w:pPr>
+    </w:p>
+    <w:p>
+      <w:pPr>
+        <w:keepNext w:val="0"/>
+        <w:keepLines w:val="0"/>
+        <w:pageBreakBefore w:val="0"/>
+        <w:widowControl w:val="0"/>
+        <w:kinsoku/>
+        <w:wordWrap/>
+        <w:overflowPunct/>
+        <w:topLinePunct w:val="0"/>
+        <w:autoSpaceDE/>
+        <w:autoSpaceDN/>
+        <w:bidi w:val="0"/>
+        <w:adjustRightInd/>
+        <w:snapToGrid/>
+        <w:spacing w:line="20" w:lineRule="exact" w:before="0" w:after="0"/>
+        <w:jc w:val="center"/>
+        <w:textAlignment w:val="auto"/>
+        <w:rPr>
+          <w:rFonts w:hint="eastAsia" w:ascii="黑体" w:hAnsi="黑体" w:eastAsia="黑体"/>
+          <w:sz w:val="32"/>
+          <w:szCs w:val="32"/>
+        </w:rPr>
+      </w:pPr>
+      <w:bookmarkStart w:id="0" w:name="_Toc33104695"/>
+      <w:bookmarkStart w:id="1" w:name="_Toc54303596"/>
     </w:p>
     <w:p>
       <w:pPr>
@@ -955,10 +982,706 @@
           <w:rFonts w:hint="eastAsia" w:ascii="黑体" w:hAnsi="黑体" w:eastAsia="黑体"/>
           <w:sz w:val="32"/>
           <w:szCs w:val="32"/>
-        </w:rPr>
-      </w:pPr>
-      <w:bookmarkStart w:id="0" w:name="_Toc33104695"/>
-      <w:bookmarkStart w:id="1" w:name="_Toc54303596"/>
+          <w:lang w:eastAsia="zh-CN"/>
+        </w:rPr>
+      </w:pPr>
+      <w:r>
+        <w:rPr>
+          <w:rFonts w:hint="eastAsia" w:ascii="黑体" w:hAnsi="黑体" w:eastAsia="黑体"/>
+          <w:b/>
+          <w:bCs/>
+          <w:sz w:val="32"/>
+          <w:szCs w:val="32"/>
+        </w:rPr>
+        <w:t>{{ title_zh }}</w:t>
+      </w:r>
+      <w:r>
+        <w:rPr>
+          <w:rFonts w:hint="eastAsia" w:ascii="黑体" w:hAnsi="黑体" w:eastAsia="黑体"/>
+          <w:b/>
+          <w:bCs/>
+          <w:sz w:val="32"/>
+          <w:szCs w:val="32"/>
+          <w:lang w:eastAsia="zh-CN"/>
+        </w:rPr>
+      </w:r>
+      <w:r>
+        <w:rPr>
+          <w:rFonts w:hint="eastAsia" w:ascii="黑体" w:hAnsi="黑体" w:eastAsia="黑体"/>
+          <w:b/>
+          <w:bCs/>
+          <w:sz w:val="32"/>
+          <w:szCs w:val="32"/>
+          <w:lang w:val="en-US" w:eastAsia="zh-CN"/>
+        </w:rPr>
+      </w:r>
+      <w:r>
+        <w:rPr>
+          <w:rFonts w:hint="eastAsia" w:ascii="黑体" w:hAnsi="黑体" w:eastAsia="黑体"/>
+          <w:b/>
+          <w:bCs/>
+          <w:sz w:val="32"/>
+          <w:szCs w:val="32"/>
+          <w:lang w:eastAsia="zh-CN"/>
+        </w:rPr>
+      </w:r>
+    </w:p>
+    <w:p>
+      <w:pPr>
+        <w:keepNext w:val="0"/>
+        <w:keepLines w:val="0"/>
+        <w:pageBreakBefore w:val="0"/>
+        <w:widowControl w:val="0"/>
+        <w:kinsoku/>
+        <w:wordWrap/>
+        <w:overflowPunct/>
+        <w:topLinePunct w:val="0"/>
+        <w:autoSpaceDE/>
+        <w:autoSpaceDN/>
+        <w:bidi w:val="0"/>
+        <w:adjustRightInd/>
+        <w:snapToGrid/>
+        <w:spacing w:line="20" w:lineRule="exact" w:before="0" w:after="0"/>
+        <w:jc w:val="center"/>
+        <w:textAlignment w:val="auto"/>
+        <w:rPr>
+          <w:rFonts w:hint="eastAsia" w:ascii="黑体" w:hAnsi="黑体" w:eastAsia="黑体"/>
+          <w:sz w:val="32"/>
+          <w:szCs w:val="32"/>
+          <w:lang w:eastAsia="zh-CN"/>
+        </w:rPr>
+      </w:pPr>
+    </w:p>
+    <w:p>
+      <w:pPr>
+        <w:pStyle w:val="3"/>
+        <w:keepNext/>
+        <w:keepLines/>
+        <w:pageBreakBefore w:val="0"/>
+        <w:widowControl w:val="0"/>
+        <w:kinsoku/>
+        <w:wordWrap/>
+        <w:overflowPunct/>
+        <w:topLinePunct w:val="0"/>
+        <w:autoSpaceDE/>
+        <w:autoSpaceDN/>
+        <w:bidi w:val="0"/>
+        <w:adjustRightInd/>
+        <w:snapToGrid/>
+        <w:spacing w:before="0" w:beforeLines="0" w:after="0" w:afterLines="0" w:line="360" w:lineRule="auto"/>
+        <w:textAlignment w:val="auto"/>
+        <w:rPr>
+          <w:rFonts w:hint="eastAsia"/>
+          <w:sz w:val="28"/>
+          <w:szCs w:val="28"/>
+          <w:lang w:eastAsia="zh-CN"/>
+        </w:rPr>
+      </w:pPr>
+      <w:bookmarkStart w:id="2" w:name="_Toc55767847"/>
+      <w:r>
+        <w:rPr>
+          <w:sz w:val="28"/>
+          <w:szCs w:val="28"/>
+        </w:rPr>
+        <w:t>摘  要</w:t>
+      </w:r>
+      <w:bookmarkEnd w:id="0"/>
+      <w:bookmarkEnd w:id="1"/>
+      <w:bookmarkEnd w:id="2"/>
+      <w:r>
+        <w:rPr>
+          <w:rFonts w:hint="eastAsia"/>
+          <w:sz w:val="28"/>
+          <w:szCs w:val="28"/>
+          <w:lang w:eastAsia="zh-CN"/>
+        </w:rPr>
+      </w:r>
+      <w:r>
+        <w:rPr>
+          <w:rFonts w:hint="eastAsia"/>
+          <w:sz w:val="28"/>
+          <w:szCs w:val="28"/>
+          <w:lang w:val="en-US" w:eastAsia="zh-CN"/>
+        </w:rPr>
+      </w:r>
+      <w:r>
+        <w:rPr>
+          <w:rFonts w:hint="eastAsia"/>
+          <w:sz w:val="28"/>
+          <w:szCs w:val="28"/>
+          <w:lang w:eastAsia="zh-CN"/>
+        </w:rPr>
+      </w:r>
+    </w:p>
+    <w:p>
+      <w:pPr>
+        <w:pageBreakBefore w:val="0"/>
+        <w:widowControl w:val="0"/>
+        <w:kinsoku/>
+        <w:wordWrap/>
+        <w:overflowPunct/>
+        <w:topLinePunct w:val="0"/>
+        <w:autoSpaceDE/>
+        <w:autoSpaceDN/>
+        <w:bidi w:val="0"/>
+        <w:adjustRightInd/>
+        <w:snapToGrid/>
+        <w:spacing w:line="20" w:lineRule="exact" w:before="0" w:after="0"/>
+        <w:textAlignment w:val="auto"/>
+        <w:rPr>
+          <w:rFonts w:hint="eastAsia"/>
+          <w:lang w:eastAsia="zh-CN"/>
+        </w:rPr>
+      </w:pPr>
+    </w:p>
+    <w:p>
+      <w:pPr>
+        <w:snapToGrid w:val="0"/>
+        <w:spacing w:line="400" w:lineRule="exact"/>
+        <w:ind w:firstLine="540" w:firstLineChars="225"/>
+        <w:rPr>
+          <w:rFonts w:ascii="宋体" w:hAnsi="宋体"/>
+          <w:sz w:val="24"/>
+        </w:rPr>
+      </w:pPr>
+      <w:r>
+        <w:rPr>
+          <w:rFonts w:hint="eastAsia" w:ascii="宋体" w:hAnsi="宋体"/>
+          <w:sz w:val="24"/>
+        </w:rPr>
+        <w:t>{{ abstract_zh }}</w:t>
+      </w:r>
+      <w:r>
+        <w:rPr>
+          <w:rFonts w:hint="eastAsia" w:ascii="宋体" w:hAnsi="宋体"/>
+          <w:color w:val="FF0000"/>
+          <w:sz w:val="24"/>
+        </w:rPr>
+      </w:r>
+      <w:r>
+        <w:rPr>
+          <w:rFonts w:hint="eastAsia" w:ascii="宋体" w:hAnsi="宋体"/>
+          <w:sz w:val="24"/>
+        </w:rPr>
+      </w:r>
+      <w:r>
+        <w:rPr>
+          <w:rFonts w:ascii="宋体" w:hAnsi="宋体"/>
+          <w:sz w:val="24"/>
+        </w:rPr>
+      </w:r>
+      <w:r>
+        <w:rPr>
+          <w:rFonts w:hint="eastAsia" w:ascii="宋体" w:hAnsi="宋体"/>
+          <w:color w:val="FF0000"/>
+          <w:sz w:val="24"/>
+          <w:lang w:val="en-US" w:eastAsia="zh-CN"/>
+        </w:rPr>
+      </w:r>
+      <w:r>
+        <w:rPr>
+          <w:rFonts w:hint="eastAsia" w:ascii="宋体" w:hAnsi="宋体"/>
+          <w:sz w:val="24"/>
+          <w:lang w:val="en-US" w:eastAsia="zh-CN"/>
+        </w:rPr>
+      </w:r>
+      <w:r>
+        <w:rPr>
+          <w:rFonts w:ascii="宋体" w:hAnsi="宋体"/>
+          <w:sz w:val="24"/>
+        </w:rPr>
+      </w:r>
+      <w:r>
+        <w:rPr>
+          <w:rFonts w:hint="eastAsia" w:ascii="宋体" w:hAnsi="宋体"/>
+          <w:sz w:val="24"/>
+        </w:rPr>
+      </w:r>
+      <w:r>
+        <w:rPr>
+          <w:rFonts w:ascii="宋体" w:hAnsi="宋体"/>
+          <w:sz w:val="24"/>
+        </w:rPr>
+      </w:r>
+      <w:r>
+        <w:rPr>
+          <w:rFonts w:hint="eastAsia" w:ascii="宋体" w:hAnsi="宋体"/>
+          <w:color w:val="FF0000"/>
+          <w:sz w:val="24"/>
+          <w:lang w:val="en-US" w:eastAsia="zh-CN"/>
+        </w:rPr>
+      </w:r>
+      <w:r>
+        <w:rPr>
+          <w:rFonts w:hint="eastAsia" w:ascii="宋体" w:hAnsi="宋体"/>
+          <w:color w:val="FF0000"/>
+          <w:sz w:val="24"/>
+        </w:rPr>
+      </w:r>
+      <w:r>
+        <w:rPr>
+          <w:rFonts w:hint="eastAsia" w:ascii="宋体" w:hAnsi="宋体"/>
+          <w:sz w:val="24"/>
+        </w:rPr>
+      </w:r>
+      <w:r>
+        <w:rPr>
+          <w:rFonts w:ascii="宋体" w:hAnsi="宋体"/>
+          <w:sz w:val="24"/>
+        </w:rPr>
+      </w:r>
+    </w:p>
+    <w:p>
+      <w:pPr>
+        <w:pStyle w:val="2"/>
+        <w:numPr>
+          <w:ilvl w:val="8"/>
+          <w:numId w:val="0"/>
+        </w:numPr>
+        <w:spacing w:before="0" w:after="0" w:line="20" w:lineRule="exact"/>
+        <w:ind w:left="1200" w:leftChars="0"/>
+      </w:pPr>
+    </w:p>
+    <w:p>
+      <w:pPr>
+        <w:snapToGrid w:val="0"/>
+        <w:spacing w:line="400" w:lineRule="exact"/>
+        <w:ind w:firstLine="540" w:firstLineChars="225"/>
+        <w:rPr>
+          <w:rFonts w:hint="eastAsia" w:ascii="宋体" w:hAnsi="宋体"/>
+          <w:sz w:val="24"/>
+        </w:rPr>
+      </w:pPr>
+      <w:r>
+        <w:rPr>
+          <w:rFonts w:hint="eastAsia" w:ascii="宋体" w:hAnsi="宋体"/>
+          <w:sz w:val="24"/>
+        </w:rPr>
+      </w:r>
+      <w:r>
+        <w:rPr>
+          <w:rFonts w:hint="eastAsia" w:ascii="宋体" w:hAnsi="宋体"/>
+          <w:sz w:val="24"/>
+          <w:lang w:val="en-US" w:eastAsia="zh-CN"/>
+        </w:rPr>
+      </w:r>
+      <w:r>
+        <w:rPr>
+          <w:rFonts w:hint="eastAsia" w:ascii="宋体" w:hAnsi="宋体"/>
+          <w:sz w:val="24"/>
+        </w:rPr>
+      </w:r>
+      <w:r>
+        <w:rPr>
+          <w:rFonts w:hint="eastAsia" w:ascii="宋体" w:hAnsi="宋体"/>
+          <w:sz w:val="24"/>
+          <w:lang w:eastAsia="zh-CN"/>
+        </w:rPr>
+      </w:r>
+      <w:r>
+        <w:rPr>
+          <w:rFonts w:ascii="宋体" w:hAnsi="宋体"/>
+          <w:sz w:val="24"/>
+        </w:rPr>
+      </w:r>
+      <w:r>
+        <w:rPr>
+          <w:rFonts w:hint="eastAsia" w:ascii="宋体" w:hAnsi="宋体"/>
+          <w:sz w:val="24"/>
+        </w:rPr>
+      </w:r>
+      <w:r>
+        <w:rPr>
+          <w:rFonts w:ascii="宋体" w:hAnsi="宋体"/>
+          <w:sz w:val="24"/>
+        </w:rPr>
+      </w:r>
+      <w:r>
+        <w:rPr>
+          <w:rFonts w:hint="eastAsia" w:ascii="宋体" w:hAnsi="宋体"/>
+          <w:sz w:val="24"/>
+        </w:rPr>
+      </w:r>
+    </w:p>
+    <w:p>
+      <w:pPr>
+        <w:pStyle w:val="2"/>
+        <w:numPr>
+          <w:ilvl w:val="8"/>
+          <w:numId w:val="0"/>
+        </w:numPr>
+        <w:spacing w:before="0" w:after="0" w:line="20" w:lineRule="exact"/>
+        <w:ind w:left="1200" w:leftChars="0"/>
+        <w:rPr>
+          <w:rFonts w:hint="eastAsia"/>
+        </w:rPr>
+      </w:pPr>
+    </w:p>
+    <w:p>
+      <w:pPr>
+        <w:pStyle w:val="5"/>
+        <w:ind w:firstLine="480" w:firstLineChars="200"/>
+        <w:rPr>
+          <w:rFonts w:hint="eastAsia" w:ascii="仿宋_GB2312" w:hAnsi="Times New Roman" w:eastAsia="仿宋_GB2312" w:cs="Times New Roman"/>
+          <w:b w:val="0"/>
+          <w:bCs/>
+          <w:sz w:val="28"/>
+          <w:szCs w:val="28"/>
+          <w:lang w:val="en-US" w:eastAsia="zh-CN"/>
+        </w:rPr>
+      </w:pPr>
+      <w:r>
+        <w:rPr>
+          <w:rFonts w:ascii="宋体" w:hAnsi="宋体"/>
+          <w:sz w:val="24"/>
+        </w:rPr>
+      </w:r>
+      <w:r>
+        <w:rPr>
+          <w:rFonts w:hint="eastAsia" w:ascii="宋体" w:hAnsi="宋体"/>
+          <w:sz w:val="24"/>
+        </w:rPr>
+      </w:r>
+      <w:r>
+        <w:rPr>
+          <w:rFonts w:ascii="宋体" w:hAnsi="宋体"/>
+          <w:sz w:val="24"/>
+        </w:rPr>
+      </w:r>
+      <w:r>
+        <w:rPr>
+          <w:rFonts w:hint="eastAsia" w:ascii="宋体" w:hAnsi="宋体"/>
+          <w:sz w:val="24"/>
+        </w:rPr>
+      </w:r>
+      <w:r>
+        <w:rPr>
+          <w:rFonts w:ascii="宋体" w:hAnsi="宋体"/>
+          <w:sz w:val="24"/>
+        </w:rPr>
+      </w:r>
+      <w:r>
+        <w:rPr>
+          <w:rFonts w:ascii="宋体" w:hAnsi="宋体"/>
+          <w:color w:val="FF0000"/>
+          <w:sz w:val="24"/>
+        </w:rPr>
+      </w:r>
+      <w:r>
+        <w:rPr>
+          <w:rFonts w:ascii="宋体" w:hAnsi="宋体"/>
+          <w:sz w:val="24"/>
+        </w:rPr>
+      </w:r>
+      <w:r>
+        <w:rPr>
+          <w:rFonts w:hint="eastAsia" w:ascii="仿宋_GB2312" w:hAnsi="Times New Roman" w:eastAsia="仿宋_GB2312" w:cs="Times New Roman"/>
+          <w:b w:val="0"/>
+          <w:bCs/>
+          <w:sz w:val="28"/>
+          <w:szCs w:val="28"/>
+        </w:rPr>
+      </w:r>
+      <w:r>
+        <w:rPr>
+          <w:rFonts w:hint="eastAsia" w:ascii="仿宋_GB2312" w:hAnsi="Times New Roman" w:eastAsia="仿宋_GB2312" w:cs="Times New Roman"/>
+          <w:b w:val="0"/>
+          <w:bCs/>
+          <w:color w:val="FF0000"/>
+          <w:sz w:val="28"/>
+          <w:szCs w:val="28"/>
+          <w:lang w:val="en-US" w:eastAsia="zh-CN"/>
+        </w:rPr>
+      </w:r>
+      <w:r>
+        <w:rPr>
+          <w:rFonts w:hint="eastAsia" w:ascii="仿宋_GB2312" w:hAnsi="Times New Roman" w:eastAsia="仿宋_GB2312" w:cs="Times New Roman"/>
+          <w:b w:val="0"/>
+          <w:bCs/>
+          <w:sz w:val="28"/>
+          <w:szCs w:val="28"/>
+        </w:rPr>
+      </w:r>
+      <w:r>
+        <w:rPr>
+          <w:rFonts w:hint="eastAsia" w:ascii="仿宋_GB2312" w:hAnsi="Times New Roman" w:eastAsia="仿宋_GB2312" w:cs="Times New Roman"/>
+          <w:b w:val="0"/>
+          <w:bCs/>
+          <w:color w:val="FF0000"/>
+          <w:sz w:val="28"/>
+          <w:szCs w:val="28"/>
+        </w:rPr>
+      </w:r>
+      <w:r>
+        <w:rPr>
+          <w:rFonts w:hint="eastAsia" w:ascii="仿宋_GB2312" w:hAnsi="Times New Roman" w:eastAsia="仿宋_GB2312" w:cs="Times New Roman"/>
+          <w:b w:val="0"/>
+          <w:bCs/>
+          <w:sz w:val="28"/>
+          <w:szCs w:val="28"/>
+        </w:rPr>
+      </w:r>
+      <w:r>
+        <w:rPr>
+          <w:rFonts w:hint="eastAsia" w:ascii="仿宋_GB2312" w:hAnsi="Times New Roman" w:eastAsia="仿宋_GB2312" w:cs="Times New Roman"/>
+          <w:b w:val="0"/>
+          <w:bCs/>
+          <w:color w:val="FF0000"/>
+          <w:sz w:val="28"/>
+          <w:szCs w:val="28"/>
+        </w:rPr>
+      </w:r>
+      <w:r>
+        <w:rPr>
+          <w:rFonts w:hint="eastAsia" w:ascii="仿宋_GB2312" w:hAnsi="Times New Roman" w:eastAsia="仿宋_GB2312" w:cs="Times New Roman"/>
+          <w:b w:val="0"/>
+          <w:bCs/>
+          <w:sz w:val="28"/>
+          <w:szCs w:val="28"/>
+        </w:rPr>
+      </w:r>
+      <w:r>
+        <w:rPr>
+          <w:rFonts w:hint="eastAsia" w:ascii="仿宋_GB2312" w:hAnsi="Times New Roman" w:eastAsia="仿宋_GB2312" w:cs="Times New Roman"/>
+          <w:b w:val="0"/>
+          <w:bCs/>
+          <w:sz w:val="28"/>
+          <w:szCs w:val="28"/>
+          <w:lang w:val="en-US" w:eastAsia="zh-CN"/>
+        </w:rPr>
+      </w:r>
+      <w:r>
+        <w:rPr>
+          <w:rFonts w:hint="eastAsia" w:ascii="仿宋_GB2312" w:hAnsi="Times New Roman" w:eastAsia="仿宋_GB2312" w:cs="Times New Roman"/>
+          <w:b w:val="0"/>
+          <w:bCs/>
+          <w:sz w:val="28"/>
+          <w:szCs w:val="28"/>
+        </w:rPr>
+      </w:r>
+      <w:r>
+        <w:rPr>
+          <w:rFonts w:hint="eastAsia" w:ascii="仿宋_GB2312" w:hAnsi="Times New Roman" w:eastAsia="仿宋_GB2312" w:cs="Times New Roman"/>
+          <w:b w:val="0"/>
+          <w:bCs/>
+          <w:color w:val="FF0000"/>
+          <w:sz w:val="28"/>
+          <w:szCs w:val="28"/>
+        </w:rPr>
+      </w:r>
+      <w:r>
+        <w:rPr>
+          <w:rFonts w:hint="eastAsia" w:ascii="仿宋_GB2312" w:hAnsi="Times New Roman" w:eastAsia="仿宋_GB2312" w:cs="Times New Roman"/>
+          <w:b w:val="0"/>
+          <w:bCs/>
+          <w:sz w:val="28"/>
+          <w:szCs w:val="28"/>
+          <w:lang w:eastAsia="zh-CN"/>
+        </w:rPr>
+      </w:r>
+      <w:r>
+        <w:rPr>
+          <w:rFonts w:hint="eastAsia" w:ascii="仿宋_GB2312" w:hAnsi="Times New Roman" w:eastAsia="仿宋_GB2312" w:cs="Times New Roman"/>
+          <w:b w:val="0"/>
+          <w:bCs/>
+          <w:sz w:val="28"/>
+          <w:szCs w:val="28"/>
+          <w:lang w:val="en-US" w:eastAsia="zh-CN"/>
+        </w:rPr>
+      </w:r>
+      <w:r>
+        <w:rPr>
+          <w:rFonts w:hint="eastAsia" w:ascii="仿宋_GB2312" w:hAnsi="Times New Roman" w:eastAsia="仿宋_GB2312" w:cs="Times New Roman"/>
+          <w:b w:val="0"/>
+          <w:bCs/>
+          <w:color w:val="FF0000"/>
+          <w:sz w:val="28"/>
+          <w:szCs w:val="28"/>
+          <w:lang w:val="en-US" w:eastAsia="zh-CN"/>
+        </w:rPr>
+      </w:r>
+      <w:r>
+        <w:rPr>
+          <w:rFonts w:hint="eastAsia" w:ascii="仿宋_GB2312" w:hAnsi="Times New Roman" w:eastAsia="仿宋_GB2312" w:cs="Times New Roman"/>
+          <w:b w:val="0"/>
+          <w:bCs/>
+          <w:sz w:val="28"/>
+          <w:szCs w:val="28"/>
+          <w:lang w:val="en-US" w:eastAsia="zh-CN"/>
+        </w:rPr>
+      </w:r>
+    </w:p>
+    <w:p>
+      <w:pPr>
+        <w:pStyle w:val="5"/>
+        <w:spacing w:before="0" w:after="0" w:line="20" w:lineRule="exact"/>
+        <w:ind w:firstLine="560" w:firstLineChars="200"/>
+        <w:rPr>
+          <w:rFonts w:hint="eastAsia" w:ascii="仿宋_GB2312" w:hAnsi="Times New Roman" w:eastAsia="仿宋_GB2312" w:cs="Times New Roman"/>
+          <w:b w:val="0"/>
+          <w:bCs/>
+          <w:sz w:val="28"/>
+          <w:szCs w:val="28"/>
+          <w:lang w:val="en-US" w:eastAsia="zh-CN"/>
+        </w:rPr>
+      </w:pPr>
+    </w:p>
+    <w:p>
+      <w:pPr>
+        <w:snapToGrid w:val="0"/>
+        <w:spacing w:line="400" w:lineRule="exact"/>
+        <w:ind w:firstLine="540" w:firstLineChars="225"/>
+        <w:rPr>
+          <w:rFonts w:ascii="宋体" w:hAnsi="宋体"/>
+          <w:sz w:val="24"/>
+        </w:rPr>
+      </w:pPr>
+      <w:r>
+        <w:rPr>
+          <w:rFonts w:hint="eastAsia" w:ascii="宋体" w:hAnsi="宋体"/>
+          <w:sz w:val="24"/>
+        </w:rPr>
+      </w:r>
+      <w:r>
+        <w:rPr>
+          <w:rFonts w:hint="eastAsia" w:ascii="宋体" w:hAnsi="宋体"/>
+          <w:color w:val="FF0000"/>
+          <w:sz w:val="24"/>
+        </w:rPr>
+      </w:r>
+      <w:r>
+        <w:rPr>
+          <w:rFonts w:hint="eastAsia" w:ascii="宋体" w:hAnsi="宋体"/>
+          <w:sz w:val="24"/>
+        </w:rPr>
+      </w:r>
+    </w:p>
+    <w:p>
+      <w:pPr>
+        <w:spacing w:line="20" w:lineRule="exact" w:before="0" w:after="0"/>
+        <w:ind w:firstLine="480" w:firstLineChars="200"/>
+        <w:rPr>
+          <w:rFonts w:ascii="楷体" w:hAnsi="楷体" w:eastAsia="楷体"/>
+          <w:sz w:val="24"/>
+          <w:szCs w:val="22"/>
+        </w:rPr>
+      </w:pPr>
+    </w:p>
+    <w:p>
+      <w:pPr>
+        <w:spacing w:line="400" w:lineRule="exact"/>
+        <w:jc w:val="left"/>
+        <w:rPr>
+          <w:rFonts w:ascii="楷体_GB2312" w:eastAsia="楷体_GB2312"/>
+          <w:sz w:val="24"/>
+        </w:rPr>
+      </w:pPr>
+      <w:r>
+        <w:rPr>
+          <w:rFonts w:hint="eastAsia" w:ascii="黑体" w:hAnsi="黑体" w:eastAsia="黑体"/>
+          <w:sz w:val="28"/>
+        </w:rPr>
+        <w:t>关键词：</w:t>
+      </w:r>
+      <w:r>
+        <w:rPr>
+          <w:rFonts w:hint="eastAsia" w:ascii="宋体" w:hAnsi="宋体"/>
+          <w:sz w:val="24"/>
+        </w:rPr>
+        <w:t>{{ keywords_zh }}</w:t>
+      </w:r>
+      <w:r>
+        <w:rPr>
+          <w:rFonts w:hint="eastAsia" w:ascii="宋体" w:hAnsi="宋体"/>
+          <w:color w:val="FF0000"/>
+          <w:sz w:val="24"/>
+        </w:rPr>
+      </w:r>
+      <w:r>
+        <w:rPr>
+          <w:rFonts w:hint="eastAsia" w:ascii="宋体" w:hAnsi="宋体"/>
+          <w:sz w:val="24"/>
+        </w:rPr>
+      </w:r>
+      <w:r>
+        <w:rPr>
+          <w:rFonts w:hint="eastAsia" w:ascii="宋体" w:hAnsi="宋体"/>
+          <w:color w:val="FF0000"/>
+          <w:sz w:val="24"/>
+        </w:rPr>
+      </w:r>
+      <w:r>
+        <w:rPr>
+          <w:rFonts w:hint="eastAsia" w:ascii="宋体" w:hAnsi="宋体"/>
+          <w:sz w:val="24"/>
+        </w:rPr>
+      </w:r>
+      <w:r>
+        <w:rPr>
+          <w:rFonts w:hint="eastAsia" w:ascii="宋体" w:hAnsi="宋体"/>
+          <w:color w:val="FF0000"/>
+          <w:sz w:val="24"/>
+        </w:rPr>
+      </w:r>
+      <w:r>
+        <w:rPr>
+          <w:rFonts w:hint="eastAsia" w:ascii="宋体" w:hAnsi="宋体"/>
+          <w:sz w:val="24"/>
+        </w:rPr>
+      </w:r>
+    </w:p>
+    <w:p>
+      <w:pPr>
+        <w:keepNext w:val="0"/>
+        <w:keepLines w:val="0"/>
+        <w:pageBreakBefore w:val="0"/>
+        <w:widowControl w:val="0"/>
+        <w:kinsoku/>
+        <w:wordWrap/>
+        <w:overflowPunct/>
+        <w:topLinePunct w:val="0"/>
+        <w:autoSpaceDE/>
+        <w:autoSpaceDN/>
+        <w:bidi w:val="0"/>
+        <w:adjustRightInd/>
+        <w:snapToGrid/>
+        <w:spacing w:line="400" w:lineRule="exact"/>
+        <w:jc w:val="center"/>
+        <w:textAlignment w:val="auto"/>
+        <w:rPr>
+          <w:rFonts w:eastAsia="黑体"/>
+        </w:rPr>
+      </w:pPr>
+      <w:r>
+        <w:rPr>
+          <w:rFonts w:eastAsia="黑体"/>
+        </w:rPr>
+        <w:br w:type="page"/>
+      </w:r>
+      <w:bookmarkStart w:id="3" w:name="_Toc54303597"/>
+    </w:p>
+    <w:p>
+      <w:pPr>
+        <w:keepNext w:val="0"/>
+        <w:keepLines w:val="0"/>
+        <w:pageBreakBefore w:val="0"/>
+        <w:widowControl w:val="0"/>
+        <w:kinsoku/>
+        <w:wordWrap/>
+        <w:overflowPunct/>
+        <w:topLinePunct w:val="0"/>
+        <w:autoSpaceDE/>
+        <w:autoSpaceDN/>
+        <w:bidi w:val="0"/>
+        <w:adjustRightInd/>
+        <w:snapToGrid/>
+        <w:spacing w:line="20" w:lineRule="exact" w:before="0" w:after="0"/>
+        <w:jc w:val="center"/>
+        <w:textAlignment w:val="auto"/>
+        <w:rPr>
+          <w:rFonts w:eastAsia="黑体"/>
+        </w:rPr>
+      </w:pPr>
     </w:p>
     <w:p>
       <w:pPr>
@@ -979,50 +1702,73 @@
         <w:jc w:val="center"/>
         <w:textAlignment w:val="auto"/>
         <w:rPr>
-          <w:rFonts w:hint="eastAsia" w:ascii="黑体" w:hAnsi="黑体" w:eastAsia="黑体"/>
+          <w:rFonts w:hint="eastAsia"/>
+          <w:b/>
           <w:sz w:val="32"/>
-          <w:szCs w:val="32"/>
+        </w:rPr>
+      </w:pPr>
+      <w:r>
+        <w:rPr>
+          <w:b/>
+          <w:sz w:val="32"/>
+        </w:rPr>
+        <w:t>{{ title_en }}</w:t>
+      </w:r>
+      <w:r>
+        <w:rPr>
+          <w:rFonts w:hint="eastAsia"/>
+          <w:b/>
+          <w:sz w:val="32"/>
+        </w:rPr>
+      </w:r>
+      <w:r>
+        <w:rPr>
+          <w:rFonts w:hint="eastAsia"/>
+          <w:b/>
+          <w:color w:val="FF0000"/>
+          <w:sz w:val="32"/>
+        </w:rPr>
+      </w:r>
+      <w:r>
+        <w:rPr>
+          <w:rFonts w:hint="eastAsia"/>
+          <w:b/>
+          <w:color w:val="FF0000"/>
+          <w:sz w:val="32"/>
           <w:lang w:eastAsia="zh-CN"/>
         </w:rPr>
-      </w:pPr>
-      <w:r>
-        <w:rPr>
-          <w:rFonts w:hint="eastAsia" w:ascii="黑体" w:hAnsi="黑体" w:eastAsia="黑体"/>
+      </w:r>
+      <w:r>
+        <w:rPr>
+          <w:rFonts w:hint="eastAsia"/>
           <w:b/>
-          <w:bCs/>
+          <w:color w:val="FF0000"/>
           <w:sz w:val="32"/>
-          <w:szCs w:val="32"/>
-        </w:rPr>
-        <w:t>{{ title_zh }}</w:t>
-      </w:r>
-      <w:r>
-        <w:rPr>
-          <w:rFonts w:hint="eastAsia" w:ascii="黑体" w:hAnsi="黑体" w:eastAsia="黑体"/>
+          <w:lang w:val="en-US" w:eastAsia="zh-CN"/>
+        </w:rPr>
+      </w:r>
+      <w:r>
+        <w:rPr>
+          <w:rFonts w:hint="eastAsia"/>
           <w:b/>
-          <w:bCs/>
           <w:sz w:val="32"/>
-          <w:szCs w:val="32"/>
+          <w:lang w:val="en-US" w:eastAsia="zh-CN"/>
+        </w:rPr>
+      </w:r>
+      <w:r>
+        <w:rPr>
+          <w:rFonts w:hint="eastAsia"/>
+          <w:b/>
+          <w:color w:val="FF0000"/>
+          <w:sz w:val="32"/>
           <w:lang w:eastAsia="zh-CN"/>
         </w:rPr>
       </w:r>
       <w:r>
         <w:rPr>
-          <w:rFonts w:hint="eastAsia" w:ascii="黑体" w:hAnsi="黑体" w:eastAsia="黑体"/>
+          <w:rFonts w:hint="eastAsia"/>
           <w:b/>
-          <w:bCs/>
           <w:sz w:val="32"/>
-          <w:szCs w:val="32"/>
-          <w:lang w:val="en-US" w:eastAsia="zh-CN"/>
-        </w:rPr>
-      </w:r>
-      <w:r>
-        <w:rPr>
-          <w:rFonts w:hint="eastAsia" w:ascii="黑体" w:hAnsi="黑体" w:eastAsia="黑体"/>
-          <w:b/>
-          <w:bCs/>
-          <w:sz w:val="32"/>
-          <w:szCs w:val="32"/>
-          <w:lang w:eastAsia="zh-CN"/>
         </w:rPr>
       </w:r>
     </w:p>
@@ -1041,14 +1787,13 @@
         <w:bidi w:val="0"/>
         <w:adjustRightInd/>
         <w:snapToGrid/>
-        <w:spacing w:line="360" w:lineRule="auto"/>
+        <w:spacing w:line="20" w:lineRule="exact" w:before="0" w:after="0"/>
         <w:jc w:val="center"/>
         <w:textAlignment w:val="auto"/>
         <w:rPr>
-          <w:rFonts w:hint="eastAsia" w:ascii="黑体" w:hAnsi="黑体" w:eastAsia="黑体"/>
+          <w:rFonts w:hint="eastAsia"/>
+          <w:b/>
           <w:sz w:val="32"/>
-          <w:szCs w:val="32"/>
-          <w:lang w:eastAsia="zh-CN"/>
         </w:rPr>
       </w:pPr>
     </w:p>
@@ -1071,48 +1816,51 @@
         <w:spacing w:before="0" w:beforeLines="0" w:after="0" w:afterLines="0" w:line="360" w:lineRule="auto"/>
         <w:textAlignment w:val="auto"/>
         <w:rPr>
-          <w:rFonts w:hint="eastAsia"/>
+          <w:rFonts w:hint="eastAsia" w:ascii="Times New Roman" w:hAnsi="Times New Roman"/>
+          <w:b/>
           <w:sz w:val="28"/>
           <w:szCs w:val="28"/>
           <w:lang w:eastAsia="zh-CN"/>
         </w:rPr>
       </w:pPr>
-      <w:bookmarkStart w:id="2" w:name="_Toc55767847"/>
-      <w:r>
-        <w:rPr>
-          <w:sz w:val="28"/>
-          <w:szCs w:val="28"/>
-        </w:rPr>
-        <w:t>摘  要</w:t>
-      </w:r>
-      <w:bookmarkEnd w:id="0"/>
-      <w:bookmarkEnd w:id="1"/>
-      <w:bookmarkEnd w:id="2"/>
-      <w:r>
-        <w:rPr>
-          <w:rFonts w:hint="eastAsia"/>
+      <w:bookmarkStart w:id="4" w:name="_Toc55767848"/>
+      <w:r>
+        <w:rPr>
+          <w:rFonts w:ascii="Times New Roman" w:hAnsi="Times New Roman"/>
+          <w:b/>
+          <w:sz w:val="28"/>
+          <w:szCs w:val="28"/>
+        </w:rPr>
+        <w:t>ABSTRACT</w:t>
+      </w:r>
+      <w:bookmarkEnd w:id="3"/>
+      <w:bookmarkEnd w:id="4"/>
+      <w:r>
+        <w:rPr>
+          <w:rFonts w:hint="eastAsia" w:ascii="Times New Roman" w:hAnsi="Times New Roman"/>
+          <w:b/>
           <w:sz w:val="28"/>
           <w:szCs w:val="28"/>
           <w:lang w:eastAsia="zh-CN"/>
         </w:rPr>
-        <w:t>（</w:t>
-      </w:r>
-      <w:r>
-        <w:rPr>
-          <w:rFonts w:hint="eastAsia"/>
-          <w:sz w:val="28"/>
-          <w:szCs w:val="28"/>
-          <w:lang w:val="en-US" w:eastAsia="zh-CN"/>
-        </w:rPr>
-      </w:r>
-      <w:r>
-        <w:rPr>
-          <w:rFonts w:hint="eastAsia"/>
+      </w:r>
+      <w:r>
+        <w:rPr>
+          <w:rFonts w:hint="eastAsia" w:ascii="Times New Roman" w:hAnsi="Times New Roman"/>
+          <w:b/>
+          <w:sz w:val="28"/>
+          <w:szCs w:val="28"/>
+          <w:lang w:val="en-US" w:eastAsia="zh-CN"/>
+        </w:rPr>
+      </w:r>
+      <w:r>
+        <w:rPr>
+          <w:rFonts w:hint="eastAsia" w:ascii="Times New Roman" w:hAnsi="Times New Roman"/>
+          <w:b/>
           <w:sz w:val="28"/>
           <w:szCs w:val="28"/>
           <w:lang w:eastAsia="zh-CN"/>
         </w:rPr>
-        <w:t>）</w:t>
       </w:r>
     </w:p>
     <w:p>
@@ -1128,7 +1876,8 @@
         <w:bidi w:val="0"/>
         <w:adjustRightInd/>
         <w:snapToGrid/>
-        <w:spacing w:line="360" w:lineRule="auto"/>
+        <w:spacing w:line="20" w:lineRule="exact" w:before="0" w:after="0"/>
+        <w:jc w:val="center"/>
         <w:textAlignment w:val="auto"/>
         <w:rPr>
           <w:rFonts w:hint="eastAsia"/>
@@ -1151,97 +1900,8 @@
           <w:rFonts w:hint="eastAsia" w:ascii="宋体" w:hAnsi="宋体"/>
           <w:sz w:val="24"/>
         </w:rPr>
-        <w:t>{{ abstract_zh }}</w:t>
-      </w:r>
-      <w:r>
-        <w:rPr>
-          <w:rFonts w:hint="eastAsia" w:ascii="宋体" w:hAnsi="宋体"/>
-          <w:color w:val="FF0000"/>
-          <w:sz w:val="24"/>
-        </w:rPr>
-      </w:r>
-      <w:r>
-        <w:rPr>
-          <w:rFonts w:hint="eastAsia" w:ascii="宋体" w:hAnsi="宋体"/>
-          <w:sz w:val="24"/>
-        </w:rPr>
-      </w:r>
-      <w:r>
-        <w:rPr>
-          <w:rFonts w:ascii="宋体" w:hAnsi="宋体"/>
-          <w:sz w:val="24"/>
-        </w:rPr>
-      </w:r>
-      <w:r>
-        <w:rPr>
-          <w:rFonts w:hint="eastAsia" w:ascii="宋体" w:hAnsi="宋体"/>
-          <w:color w:val="FF0000"/>
-          <w:sz w:val="24"/>
-          <w:lang w:val="en-US" w:eastAsia="zh-CN"/>
-        </w:rPr>
-      </w:r>
-      <w:r>
-        <w:rPr>
-          <w:rFonts w:hint="eastAsia" w:ascii="宋体" w:hAnsi="宋体"/>
-          <w:sz w:val="24"/>
-          <w:lang w:val="en-US" w:eastAsia="zh-CN"/>
-        </w:rPr>
-      </w:r>
-      <w:r>
-        <w:rPr>
-          <w:rFonts w:ascii="宋体" w:hAnsi="宋体"/>
-          <w:sz w:val="24"/>
-        </w:rPr>
-      </w:r>
-      <w:r>
-        <w:rPr>
-          <w:rFonts w:hint="eastAsia" w:ascii="宋体" w:hAnsi="宋体"/>
-          <w:sz w:val="24"/>
-        </w:rPr>
-      </w:r>
-      <w:r>
-        <w:rPr>
-          <w:rFonts w:ascii="宋体" w:hAnsi="宋体"/>
-          <w:sz w:val="24"/>
-        </w:rPr>
-      </w:r>
-      <w:r>
-        <w:rPr>
-          <w:rFonts w:hint="eastAsia" w:ascii="宋体" w:hAnsi="宋体"/>
-          <w:color w:val="FF0000"/>
-          <w:sz w:val="24"/>
-          <w:lang w:val="en-US" w:eastAsia="zh-CN"/>
-        </w:rPr>
-      </w:r>
-      <w:r>
-        <w:rPr>
-          <w:rFonts w:hint="eastAsia" w:ascii="宋体" w:hAnsi="宋体"/>
-          <w:color w:val="FF0000"/>
-          <w:sz w:val="24"/>
-        </w:rPr>
-      </w:r>
-      <w:r>
-        <w:rPr>
-          <w:rFonts w:hint="eastAsia" w:ascii="宋体" w:hAnsi="宋体"/>
-          <w:sz w:val="24"/>
-        </w:rPr>
-      </w:r>
-      <w:r>
-        <w:rPr>
-          <w:rFonts w:ascii="宋体" w:hAnsi="宋体"/>
-          <w:sz w:val="24"/>
-        </w:rPr>
-      </w:r>
-    </w:p>
-    <w:p>
-      <w:pPr>
-        <w:pStyle w:val="2"/>
-        <w:numPr>
-          <w:ilvl w:val="8"/>
-          <w:numId w:val="0"/>
-        </w:numPr>
-        <w:ind w:left="1200" w:leftChars="0"/>
-      </w:pPr>
+        <w:t>{{ abstract_en }}</w:t>
+      </w:r>
     </w:p>
     <w:p>
       <w:pPr>
@@ -1249,10 +1909,22 @@
         <w:spacing w:line="400" w:lineRule="exact"/>
         <w:ind w:firstLine="540" w:firstLineChars="225"/>
         <w:rPr>
+          <w:rFonts w:ascii="宋体" w:hAnsi="宋体"/>
+          <w:sz w:val="24"/>
+        </w:rPr>
+      </w:pPr>
+      <w:r>
+        <w:rPr>
           <w:rFonts w:hint="eastAsia" w:ascii="宋体" w:hAnsi="宋体"/>
           <w:sz w:val="24"/>
         </w:rPr>
-      </w:pPr>
+      </w:r>
+      <w:r>
+        <w:rPr>
+          <w:rFonts w:ascii="宋体" w:hAnsi="宋体"/>
+          <w:sz w:val="24"/>
+        </w:rPr>
+      </w:r>
       <w:r>
         <w:rPr>
           <w:rFonts w:hint="eastAsia" w:ascii="宋体" w:hAnsi="宋体"/>
@@ -1261,22 +1933,35 @@
       </w:r>
       <w:r>
         <w:rPr>
+          <w:sz w:val="24"/>
+        </w:rPr>
+      </w:r>
+      <w:r>
+        <w:rPr>
+          <w:rFonts w:hint="eastAsia"/>
+          <w:sz w:val="24"/>
+        </w:rPr>
+      </w:r>
+      <w:r>
+        <w:rPr>
+          <w:sz w:val="24"/>
+        </w:rPr>
+      </w:r>
+      <w:r>
+        <w:rPr>
+          <w:rFonts w:hint="eastAsia"/>
+          <w:sz w:val="24"/>
+        </w:rPr>
+      </w:r>
+      <w:r>
+        <w:rPr>
+          <w:sz w:val="24"/>
+        </w:rPr>
+      </w:r>
+      <w:r>
+        <w:rPr>
           <w:rFonts w:hint="eastAsia" w:ascii="宋体" w:hAnsi="宋体"/>
           <w:sz w:val="24"/>
-          <w:lang w:val="en-US" w:eastAsia="zh-CN"/>
-        </w:rPr>
-      </w:r>
-      <w:r>
-        <w:rPr>
-          <w:rFonts w:hint="eastAsia" w:ascii="宋体" w:hAnsi="宋体"/>
-          <w:sz w:val="24"/>
-        </w:rPr>
-      </w:r>
-      <w:r>
-        <w:rPr>
-          <w:rFonts w:hint="eastAsia" w:ascii="宋体" w:hAnsi="宋体"/>
-          <w:sz w:val="24"/>
-          <w:lang w:eastAsia="zh-CN"/>
         </w:rPr>
       </w:r>
       <w:r>
@@ -1285,256 +1970,6 @@
           <w:sz w:val="24"/>
         </w:rPr>
       </w:r>
-      <w:r>
-        <w:rPr>
-          <w:rFonts w:hint="eastAsia" w:ascii="宋体" w:hAnsi="宋体"/>
-          <w:sz w:val="24"/>
-        </w:rPr>
-      </w:r>
-      <w:r>
-        <w:rPr>
-          <w:rFonts w:ascii="宋体" w:hAnsi="宋体"/>
-          <w:sz w:val="24"/>
-        </w:rPr>
-      </w:r>
-      <w:r>
-        <w:rPr>
-          <w:rFonts w:hint="eastAsia" w:ascii="宋体" w:hAnsi="宋体"/>
-          <w:sz w:val="24"/>
-        </w:rPr>
-      </w:r>
-    </w:p>
-    <w:p>
-      <w:pPr>
-        <w:pStyle w:val="2"/>
-        <w:numPr>
-          <w:ilvl w:val="8"/>
-          <w:numId w:val="0"/>
-        </w:numPr>
-        <w:ind w:left="1200" w:leftChars="0"/>
-        <w:rPr>
-          <w:rFonts w:hint="eastAsia"/>
-        </w:rPr>
-      </w:pPr>
-    </w:p>
-    <w:p>
-      <w:pPr>
-        <w:pStyle w:val="5"/>
-        <w:ind w:firstLine="480" w:firstLineChars="200"/>
-        <w:rPr>
-          <w:rFonts w:hint="eastAsia" w:ascii="仿宋_GB2312" w:hAnsi="Times New Roman" w:eastAsia="仿宋_GB2312" w:cs="Times New Roman"/>
-          <w:b w:val="0"/>
-          <w:bCs/>
-          <w:sz w:val="28"/>
-          <w:szCs w:val="28"/>
-          <w:lang w:val="en-US" w:eastAsia="zh-CN"/>
-        </w:rPr>
-      </w:pPr>
-      <w:r>
-        <w:rPr>
-          <w:rFonts w:ascii="宋体" w:hAnsi="宋体"/>
-          <w:sz w:val="24"/>
-        </w:rPr>
-      </w:r>
-      <w:r>
-        <w:rPr>
-          <w:rFonts w:hint="eastAsia" w:ascii="宋体" w:hAnsi="宋体"/>
-          <w:sz w:val="24"/>
-        </w:rPr>
-      </w:r>
-      <w:r>
-        <w:rPr>
-          <w:rFonts w:ascii="宋体" w:hAnsi="宋体"/>
-          <w:sz w:val="24"/>
-        </w:rPr>
-      </w:r>
-      <w:r>
-        <w:rPr>
-          <w:rFonts w:hint="eastAsia" w:ascii="宋体" w:hAnsi="宋体"/>
-          <w:sz w:val="24"/>
-        </w:rPr>
-      </w:r>
-      <w:r>
-        <w:rPr>
-          <w:rFonts w:ascii="宋体" w:hAnsi="宋体"/>
-          <w:sz w:val="24"/>
-        </w:rPr>
-      </w:r>
-      <w:r>
-        <w:rPr>
-          <w:rFonts w:ascii="宋体" w:hAnsi="宋体"/>
-          <w:color w:val="FF0000"/>
-          <w:sz w:val="24"/>
-        </w:rPr>
-      </w:r>
-      <w:r>
-        <w:rPr>
-          <w:rFonts w:ascii="宋体" w:hAnsi="宋体"/>
-          <w:sz w:val="24"/>
-        </w:rPr>
-      </w:r>
-      <w:r>
-        <w:rPr>
-          <w:rFonts w:hint="eastAsia" w:ascii="仿宋_GB2312" w:hAnsi="Times New Roman" w:eastAsia="仿宋_GB2312" w:cs="Times New Roman"/>
-          <w:b w:val="0"/>
-          <w:bCs/>
-          <w:sz w:val="28"/>
-          <w:szCs w:val="28"/>
-        </w:rPr>
-      </w:r>
-      <w:r>
-        <w:rPr>
-          <w:rFonts w:hint="eastAsia" w:ascii="仿宋_GB2312" w:hAnsi="Times New Roman" w:eastAsia="仿宋_GB2312" w:cs="Times New Roman"/>
-          <w:b w:val="0"/>
-          <w:bCs/>
-          <w:color w:val="FF0000"/>
-          <w:sz w:val="28"/>
-          <w:szCs w:val="28"/>
-          <w:lang w:val="en-US" w:eastAsia="zh-CN"/>
-        </w:rPr>
-      </w:r>
-      <w:r>
-        <w:rPr>
-          <w:rFonts w:hint="eastAsia" w:ascii="仿宋_GB2312" w:hAnsi="Times New Roman" w:eastAsia="仿宋_GB2312" w:cs="Times New Roman"/>
-          <w:b w:val="0"/>
-          <w:bCs/>
-          <w:sz w:val="28"/>
-          <w:szCs w:val="28"/>
-        </w:rPr>
-      </w:r>
-      <w:r>
-        <w:rPr>
-          <w:rFonts w:hint="eastAsia" w:ascii="仿宋_GB2312" w:hAnsi="Times New Roman" w:eastAsia="仿宋_GB2312" w:cs="Times New Roman"/>
-          <w:b w:val="0"/>
-          <w:bCs/>
-          <w:color w:val="FF0000"/>
-          <w:sz w:val="28"/>
-          <w:szCs w:val="28"/>
-        </w:rPr>
-      </w:r>
-      <w:r>
-        <w:rPr>
-          <w:rFonts w:hint="eastAsia" w:ascii="仿宋_GB2312" w:hAnsi="Times New Roman" w:eastAsia="仿宋_GB2312" w:cs="Times New Roman"/>
-          <w:b w:val="0"/>
-          <w:bCs/>
-          <w:sz w:val="28"/>
-          <w:szCs w:val="28"/>
-        </w:rPr>
-      </w:r>
-      <w:r>
-        <w:rPr>
-          <w:rFonts w:hint="eastAsia" w:ascii="仿宋_GB2312" w:hAnsi="Times New Roman" w:eastAsia="仿宋_GB2312" w:cs="Times New Roman"/>
-          <w:b w:val="0"/>
-          <w:bCs/>
-          <w:color w:val="FF0000"/>
-          <w:sz w:val="28"/>
-          <w:szCs w:val="28"/>
-        </w:rPr>
-      </w:r>
-      <w:r>
-        <w:rPr>
-          <w:rFonts w:hint="eastAsia" w:ascii="仿宋_GB2312" w:hAnsi="Times New Roman" w:eastAsia="仿宋_GB2312" w:cs="Times New Roman"/>
-          <w:b w:val="0"/>
-          <w:bCs/>
-          <w:sz w:val="28"/>
-          <w:szCs w:val="28"/>
-        </w:rPr>
-      </w:r>
-      <w:r>
-        <w:rPr>
-          <w:rFonts w:hint="eastAsia" w:ascii="仿宋_GB2312" w:hAnsi="Times New Roman" w:eastAsia="仿宋_GB2312" w:cs="Times New Roman"/>
-          <w:b w:val="0"/>
-          <w:bCs/>
-          <w:sz w:val="28"/>
-          <w:szCs w:val="28"/>
-          <w:lang w:val="en-US" w:eastAsia="zh-CN"/>
-        </w:rPr>
-      </w:r>
-      <w:r>
-        <w:rPr>
-          <w:rFonts w:hint="eastAsia" w:ascii="仿宋_GB2312" w:hAnsi="Times New Roman" w:eastAsia="仿宋_GB2312" w:cs="Times New Roman"/>
-          <w:b w:val="0"/>
-          <w:bCs/>
-          <w:sz w:val="28"/>
-          <w:szCs w:val="28"/>
-        </w:rPr>
-      </w:r>
-      <w:r>
-        <w:rPr>
-          <w:rFonts w:hint="eastAsia" w:ascii="仿宋_GB2312" w:hAnsi="Times New Roman" w:eastAsia="仿宋_GB2312" w:cs="Times New Roman"/>
-          <w:b w:val="0"/>
-          <w:bCs/>
-          <w:color w:val="FF0000"/>
-          <w:sz w:val="28"/>
-          <w:szCs w:val="28"/>
-        </w:rPr>
-      </w:r>
-      <w:r>
-        <w:rPr>
-          <w:rFonts w:hint="eastAsia" w:ascii="仿宋_GB2312" w:hAnsi="Times New Roman" w:eastAsia="仿宋_GB2312" w:cs="Times New Roman"/>
-          <w:b w:val="0"/>
-          <w:bCs/>
-          <w:sz w:val="28"/>
-          <w:szCs w:val="28"/>
-          <w:lang w:eastAsia="zh-CN"/>
-        </w:rPr>
-      </w:r>
-      <w:r>
-        <w:rPr>
-          <w:rFonts w:hint="eastAsia" w:ascii="仿宋_GB2312" w:hAnsi="Times New Roman" w:eastAsia="仿宋_GB2312" w:cs="Times New Roman"/>
-          <w:b w:val="0"/>
-          <w:bCs/>
-          <w:sz w:val="28"/>
-          <w:szCs w:val="28"/>
-          <w:lang w:val="en-US" w:eastAsia="zh-CN"/>
-        </w:rPr>
-      </w:r>
-      <w:r>
-        <w:rPr>
-          <w:rFonts w:hint="eastAsia" w:ascii="仿宋_GB2312" w:hAnsi="Times New Roman" w:eastAsia="仿宋_GB2312" w:cs="Times New Roman"/>
-          <w:b w:val="0"/>
-          <w:bCs/>
-          <w:color w:val="FF0000"/>
-          <w:sz w:val="28"/>
-          <w:szCs w:val="28"/>
-          <w:lang w:val="en-US" w:eastAsia="zh-CN"/>
-        </w:rPr>
-      </w:r>
-      <w:r>
-        <w:rPr>
-          <w:rFonts w:hint="eastAsia" w:ascii="仿宋_GB2312" w:hAnsi="Times New Roman" w:eastAsia="仿宋_GB2312" w:cs="Times New Roman"/>
-          <w:b w:val="0"/>
-          <w:bCs/>
-          <w:sz w:val="28"/>
-          <w:szCs w:val="28"/>
-          <w:lang w:val="en-US" w:eastAsia="zh-CN"/>
-        </w:rPr>
-      </w:r>
-    </w:p>
-    <w:p>
-      <w:pPr>
-        <w:pStyle w:val="5"/>
-        <w:ind w:firstLine="560" w:firstLineChars="200"/>
-        <w:rPr>
-          <w:rFonts w:hint="eastAsia" w:ascii="仿宋_GB2312" w:hAnsi="Times New Roman" w:eastAsia="仿宋_GB2312" w:cs="Times New Roman"/>
-          <w:b w:val="0"/>
-          <w:bCs/>
-          <w:sz w:val="28"/>
-          <w:szCs w:val="28"/>
-          <w:lang w:val="en-US" w:eastAsia="zh-CN"/>
-        </w:rPr>
-      </w:pPr>
-    </w:p>
-    <w:p>
-      <w:pPr>
-        <w:snapToGrid w:val="0"/>
-        <w:spacing w:line="400" w:lineRule="exact"/>
-        <w:ind w:firstLine="540" w:firstLineChars="225"/>
-        <w:rPr>
-          <w:rFonts w:ascii="宋体" w:hAnsi="宋体"/>
-          <w:sz w:val="24"/>
-        </w:rPr>
-      </w:pPr>
       <w:r>
         <w:rPr>
           <w:rFonts w:hint="eastAsia" w:ascii="宋体" w:hAnsi="宋体"/>
@@ -1557,12 +1992,22 @@
     </w:p>
     <w:p>
       <w:pPr>
-        <w:spacing w:line="400" w:lineRule="exact"/>
-        <w:ind w:firstLine="480" w:firstLineChars="200"/>
-        <w:rPr>
-          <w:rFonts w:ascii="楷体" w:hAnsi="楷体" w:eastAsia="楷体"/>
-          <w:sz w:val="24"/>
-          <w:szCs w:val="22"/>
+        <w:snapToGrid w:val="0"/>
+        <w:spacing w:line="20" w:lineRule="exact" w:before="0" w:after="0"/>
+        <w:ind w:firstLine="540" w:firstLineChars="225"/>
+        <w:rPr>
+          <w:rFonts w:ascii="宋体" w:hAnsi="宋体"/>
+          <w:sz w:val="24"/>
+        </w:rPr>
+      </w:pPr>
+    </w:p>
+    <w:p>
+      <w:pPr>
+        <w:snapToGrid w:val="0"/>
+        <w:spacing w:line="20" w:lineRule="exact" w:before="0" w:after="0"/>
+        <w:ind w:firstLine="540" w:firstLineChars="225"/>
+        <w:rPr>
+          <w:sz w:val="24"/>
         </w:rPr>
       </w:pPr>
     </w:p>
@@ -1577,28 +2022,29 @@
       </w:pPr>
       <w:r>
         <w:rPr>
-          <w:rFonts w:hint="eastAsia" w:ascii="黑体" w:hAnsi="黑体" w:eastAsia="黑体"/>
-          <w:sz w:val="28"/>
-        </w:rPr>
-        <w:t>关键词：</w:t>
-      </w:r>
-      <w:r>
-        <w:rPr>
-          <w:rFonts w:hint="eastAsia" w:ascii="宋体" w:hAnsi="宋体"/>
-          <w:sz w:val="24"/>
-        </w:rPr>
-        <w:t>{{ keywords_zh }}</w:t>
+          <w:b/>
+          <w:sz w:val="28"/>
+        </w:rPr>
+        <w:t xml:space="preserve">KEY WORDS: </w:t>
+      </w:r>
+      <w:r>
+        <w:rPr>
+          <w:rFonts w:ascii="宋体" w:hAnsi="宋体"/>
+          <w:sz w:val="24"/>
+        </w:rPr>
+        <w:t>{{ keywords_en }}</w:t>
       </w:r>
       <w:r>
         <w:rPr>
           <w:rFonts w:hint="eastAsia" w:ascii="宋体" w:hAnsi="宋体"/>
           <w:color w:val="FF0000"/>
           <w:sz w:val="24"/>
-        </w:rPr>
-      </w:r>
-      <w:r>
-        <w:rPr>
-          <w:rFonts w:hint="eastAsia" w:ascii="宋体" w:hAnsi="宋体"/>
+          <w:lang w:val="en-US" w:eastAsia="zh-CN"/>
+        </w:rPr>
+      </w:r>
+      <w:r>
+        <w:rPr>
+          <w:rFonts w:ascii="宋体" w:hAnsi="宋体"/>
           <w:sz w:val="24"/>
         </w:rPr>
       </w:r>
@@ -1607,11 +2053,12 @@
           <w:rFonts w:hint="eastAsia" w:ascii="宋体" w:hAnsi="宋体"/>
           <w:color w:val="FF0000"/>
           <w:sz w:val="24"/>
-        </w:rPr>
-      </w:r>
-      <w:r>
-        <w:rPr>
-          <w:rFonts w:hint="eastAsia" w:ascii="宋体" w:hAnsi="宋体"/>
+          <w:lang w:val="en-US" w:eastAsia="zh-CN"/>
+        </w:rPr>
+      </w:r>
+      <w:r>
+        <w:rPr>
+          <w:rFonts w:ascii="宋体" w:hAnsi="宋体"/>
           <w:sz w:val="24"/>
         </w:rPr>
       </w:r>
@@ -1620,19 +2067,45 @@
           <w:rFonts w:hint="eastAsia" w:ascii="宋体" w:hAnsi="宋体"/>
           <w:color w:val="FF0000"/>
           <w:sz w:val="24"/>
-        </w:rPr>
-      </w:r>
-      <w:r>
-        <w:rPr>
-          <w:rFonts w:hint="eastAsia" w:ascii="宋体" w:hAnsi="宋体"/>
-          <w:sz w:val="24"/>
-        </w:rPr>
-      </w:r>
-    </w:p>
-    <w:p>
-      <w:pPr>
-        <w:keepNext w:val="0"/>
-        <w:keepLines w:val="0"/>
+          <w:lang w:val="en-US" w:eastAsia="zh-CN"/>
+        </w:rPr>
+      </w:r>
+      <w:r>
+        <w:rPr>
+          <w:rFonts w:ascii="宋体" w:hAnsi="宋体"/>
+          <w:sz w:val="24"/>
+        </w:rPr>
+      </w:r>
+    </w:p>
+    <w:p>
+      <w:pPr>
+        <w:spacing w:line="20" w:lineRule="exact" w:before="0" w:after="0"/>
+        <w:ind w:firstLine="480" w:firstLineChars="200"/>
+        <w:jc w:val="left"/>
+        <w:rPr>
+          <w:rFonts w:ascii="宋体" w:hAnsi="宋体"/>
+          <w:sz w:val="24"/>
+        </w:rPr>
+      </w:pPr>
+    </w:p>
+    <w:p>
+      <w:pPr>
+        <w:pStyle w:val="3"/>
+        <w:spacing w:before="0" w:after="0" w:line="20" w:lineRule="exact"/>
+        <w:sectPr>
+          <w:headerReference r:id="rId5" w:type="default"/>
+          <w:footerReference r:id="rId6" w:type="default"/>
+          <w:pgSz w:w="11906" w:h="16838"/>
+          <w:pgMar w:top="1134" w:right="1134" w:bottom="1134" w:left="1134" w:header="284" w:footer="284" w:gutter="284"/>
+          <w:pgNumType w:fmt="upperRoman" w:start="1"/>
+          <w:cols w:space="425" w:num="1"/>
+          <w:docGrid w:linePitch="312" w:charSpace="0"/>
+        </w:sectPr>
+      </w:pPr>
+    </w:p>
+    <w:p>
+      <w:pPr>
+        <w:pStyle w:val="3"/>
         <w:pageBreakBefore w:val="0"/>
         <w:widowControl w:val="0"/>
         <w:kinsoku/>
@@ -1644,464 +2117,13 @@
         <w:bidi w:val="0"/>
         <w:adjustRightInd/>
         <w:snapToGrid/>
-        <w:spacing w:line="400" w:lineRule="exact"/>
-        <w:jc w:val="center"/>
+        <w:spacing w:before="0" w:beforeLines="0" w:after="0" w:afterLines="0" w:line="20" w:lineRule="exact"/>
         <w:textAlignment w:val="auto"/>
         <w:rPr>
-          <w:rFonts w:eastAsia="黑体"/>
-        </w:rPr>
-      </w:pPr>
-      <w:r>
-        <w:rPr>
-          <w:rFonts w:eastAsia="黑体"/>
-        </w:rPr>
-        <w:br w:type="page"/>
-      </w:r>
-      <w:bookmarkStart w:id="3" w:name="_Toc54303597"/>
-    </w:p>
-    <w:p>
-      <w:pPr>
-        <w:keepNext w:val="0"/>
-        <w:keepLines w:val="0"/>
-        <w:pageBreakBefore w:val="0"/>
-        <w:widowControl w:val="0"/>
-        <w:kinsoku/>
-        <w:wordWrap/>
-        <w:overflowPunct/>
-        <w:topLinePunct w:val="0"/>
-        <w:autoSpaceDE/>
-        <w:autoSpaceDN/>
-        <w:bidi w:val="0"/>
-        <w:adjustRightInd/>
-        <w:snapToGrid/>
-        <w:spacing w:line="360" w:lineRule="auto"/>
-        <w:jc w:val="center"/>
-        <w:textAlignment w:val="auto"/>
-        <w:rPr>
-          <w:rFonts w:eastAsia="黑体"/>
-        </w:rPr>
-      </w:pPr>
-    </w:p>
-    <w:p>
-      <w:pPr>
-        <w:keepNext w:val="0"/>
-        <w:keepLines w:val="0"/>
-        <w:pageBreakBefore w:val="0"/>
-        <w:widowControl w:val="0"/>
-        <w:kinsoku/>
-        <w:wordWrap/>
-        <w:overflowPunct/>
-        <w:topLinePunct w:val="0"/>
-        <w:autoSpaceDE/>
-        <w:autoSpaceDN/>
-        <w:bidi w:val="0"/>
-        <w:adjustRightInd/>
-        <w:snapToGrid/>
-        <w:spacing w:line="360" w:lineRule="auto"/>
-        <w:jc w:val="center"/>
-        <w:textAlignment w:val="auto"/>
-        <w:rPr>
-          <w:rFonts w:hint="eastAsia"/>
-          <w:b/>
-          <w:sz w:val="32"/>
-        </w:rPr>
-      </w:pPr>
-      <w:r>
-        <w:rPr>
-          <w:b/>
-          <w:sz w:val="32"/>
-        </w:rPr>
-        <w:t>{{ title_en }}</w:t>
-      </w:r>
-      <w:r>
-        <w:rPr>
-          <w:rFonts w:hint="eastAsia"/>
-          <w:b/>
-          <w:sz w:val="32"/>
-        </w:rPr>
-      </w:r>
-      <w:r>
-        <w:rPr>
-          <w:rFonts w:hint="eastAsia"/>
-          <w:b/>
-          <w:color w:val="FF0000"/>
-          <w:sz w:val="32"/>
-        </w:rPr>
-      </w:r>
-      <w:r>
-        <w:rPr>
-          <w:rFonts w:hint="eastAsia"/>
-          <w:b/>
-          <w:color w:val="FF0000"/>
-          <w:sz w:val="32"/>
-          <w:lang w:eastAsia="zh-CN"/>
-        </w:rPr>
-      </w:r>
-      <w:r>
-        <w:rPr>
-          <w:rFonts w:hint="eastAsia"/>
-          <w:b/>
-          <w:color w:val="FF0000"/>
-          <w:sz w:val="32"/>
-          <w:lang w:val="en-US" w:eastAsia="zh-CN"/>
-        </w:rPr>
-      </w:r>
-      <w:r>
-        <w:rPr>
-          <w:rFonts w:hint="eastAsia"/>
-          <w:b/>
-          <w:sz w:val="32"/>
-          <w:lang w:val="en-US" w:eastAsia="zh-CN"/>
-        </w:rPr>
-      </w:r>
-      <w:r>
-        <w:rPr>
-          <w:rFonts w:hint="eastAsia"/>
-          <w:b/>
-          <w:color w:val="FF0000"/>
-          <w:sz w:val="32"/>
-          <w:lang w:eastAsia="zh-CN"/>
-        </w:rPr>
-      </w:r>
-      <w:r>
-        <w:rPr>
-          <w:rFonts w:hint="eastAsia"/>
-          <w:b/>
-          <w:sz w:val="32"/>
-        </w:rPr>
-      </w:r>
-    </w:p>
-    <w:p>
-      <w:pPr>
-        <w:keepNext w:val="0"/>
-        <w:keepLines w:val="0"/>
-        <w:pageBreakBefore w:val="0"/>
-        <w:widowControl w:val="0"/>
-        <w:kinsoku/>
-        <w:wordWrap/>
-        <w:overflowPunct/>
-        <w:topLinePunct w:val="0"/>
-        <w:autoSpaceDE/>
-        <w:autoSpaceDN/>
-        <w:bidi w:val="0"/>
-        <w:adjustRightInd/>
-        <w:snapToGrid/>
-        <w:spacing w:line="360" w:lineRule="auto"/>
-        <w:jc w:val="center"/>
-        <w:textAlignment w:val="auto"/>
-        <w:rPr>
-          <w:rFonts w:hint="eastAsia"/>
-          <w:b/>
-          <w:sz w:val="32"/>
-        </w:rPr>
-      </w:pPr>
-    </w:p>
-    <w:p>
-      <w:pPr>
-        <w:pStyle w:val="3"/>
-        <w:keepNext/>
-        <w:keepLines/>
-        <w:pageBreakBefore w:val="0"/>
-        <w:widowControl w:val="0"/>
-        <w:kinsoku/>
-        <w:wordWrap/>
-        <w:overflowPunct/>
-        <w:topLinePunct w:val="0"/>
-        <w:autoSpaceDE/>
-        <w:autoSpaceDN/>
-        <w:bidi w:val="0"/>
-        <w:adjustRightInd/>
-        <w:snapToGrid/>
-        <w:spacing w:before="0" w:beforeLines="0" w:after="0" w:afterLines="0" w:line="360" w:lineRule="auto"/>
-        <w:textAlignment w:val="auto"/>
-        <w:rPr>
-          <w:rFonts w:hint="eastAsia" w:ascii="Times New Roman" w:hAnsi="Times New Roman"/>
-          <w:b/>
-          <w:sz w:val="28"/>
-          <w:szCs w:val="28"/>
-          <w:lang w:eastAsia="zh-CN"/>
-        </w:rPr>
-      </w:pPr>
-      <w:bookmarkStart w:id="4" w:name="_Toc55767848"/>
-      <w:r>
-        <w:rPr>
-          <w:rFonts w:ascii="Times New Roman" w:hAnsi="Times New Roman"/>
-          <w:b/>
-          <w:sz w:val="28"/>
-          <w:szCs w:val="28"/>
-        </w:rPr>
-        <w:t>ABSTRACT</w:t>
-      </w:r>
-      <w:bookmarkEnd w:id="3"/>
-      <w:bookmarkEnd w:id="4"/>
-      <w:r>
-        <w:rPr>
-          <w:rFonts w:hint="eastAsia" w:ascii="Times New Roman" w:hAnsi="Times New Roman"/>
-          <w:b/>
-          <w:sz w:val="28"/>
-          <w:szCs w:val="28"/>
-          <w:lang w:eastAsia="zh-CN"/>
-        </w:rPr>
-        <w:t>（</w:t>
-      </w:r>
-      <w:r>
-        <w:rPr>
-          <w:rFonts w:hint="eastAsia" w:ascii="Times New Roman" w:hAnsi="Times New Roman"/>
-          <w:b/>
-          <w:sz w:val="28"/>
-          <w:szCs w:val="28"/>
-          <w:lang w:val="en-US" w:eastAsia="zh-CN"/>
-        </w:rPr>
-      </w:r>
-      <w:r>
-        <w:rPr>
-          <w:rFonts w:hint="eastAsia" w:ascii="Times New Roman" w:hAnsi="Times New Roman"/>
-          <w:b/>
-          <w:sz w:val="28"/>
-          <w:szCs w:val="28"/>
-          <w:lang w:eastAsia="zh-CN"/>
-        </w:rPr>
-      </w:r>
-    </w:p>
-    <w:p>
-      <w:pPr>
-        <w:pageBreakBefore w:val="0"/>
-        <w:widowControl w:val="0"/>
-        <w:kinsoku/>
-        <w:wordWrap/>
-        <w:overflowPunct/>
-        <w:topLinePunct w:val="0"/>
-        <w:autoSpaceDE/>
-        <w:autoSpaceDN/>
-        <w:bidi w:val="0"/>
-        <w:adjustRightInd/>
-        <w:snapToGrid/>
-        <w:spacing w:line="360" w:lineRule="auto"/>
-        <w:jc w:val="center"/>
-        <w:textAlignment w:val="auto"/>
-        <w:rPr>
-          <w:rFonts w:hint="eastAsia"/>
-          <w:lang w:eastAsia="zh-CN"/>
-        </w:rPr>
-      </w:pPr>
-    </w:p>
-    <w:p>
-      <w:pPr>
-        <w:snapToGrid w:val="0"/>
-        <w:spacing w:line="400" w:lineRule="exact"/>
-        <w:ind w:firstLine="540" w:firstLineChars="225"/>
-        <w:rPr>
-          <w:rFonts w:ascii="宋体" w:hAnsi="宋体"/>
-          <w:sz w:val="24"/>
-        </w:rPr>
-      </w:pPr>
-      <w:r>
-        <w:rPr>
-          <w:rFonts w:hint="eastAsia" w:ascii="宋体" w:hAnsi="宋体"/>
-          <w:sz w:val="24"/>
-        </w:rPr>
-        <w:t>{{ abstract_en }}</w:t>
-      </w:r>
-    </w:p>
-    <w:p>
-      <w:pPr>
-        <w:snapToGrid w:val="0"/>
-        <w:spacing w:line="400" w:lineRule="exact"/>
-        <w:ind w:firstLine="540" w:firstLineChars="225"/>
-        <w:rPr>
-          <w:rFonts w:ascii="宋体" w:hAnsi="宋体"/>
-          <w:sz w:val="24"/>
-        </w:rPr>
-      </w:pPr>
-      <w:r>
-        <w:rPr>
-          <w:rFonts w:hint="eastAsia" w:ascii="宋体" w:hAnsi="宋体"/>
-          <w:sz w:val="24"/>
-        </w:rPr>
-      </w:r>
-      <w:r>
-        <w:rPr>
-          <w:rFonts w:ascii="宋体" w:hAnsi="宋体"/>
-          <w:sz w:val="24"/>
-        </w:rPr>
-      </w:r>
-      <w:r>
-        <w:rPr>
-          <w:rFonts w:hint="eastAsia" w:ascii="宋体" w:hAnsi="宋体"/>
-          <w:sz w:val="24"/>
-        </w:rPr>
-      </w:r>
-      <w:r>
-        <w:rPr>
-          <w:sz w:val="24"/>
-        </w:rPr>
-      </w:r>
-      <w:r>
-        <w:rPr>
-          <w:rFonts w:hint="eastAsia"/>
-          <w:sz w:val="24"/>
-        </w:rPr>
-      </w:r>
-      <w:r>
-        <w:rPr>
-          <w:sz w:val="24"/>
-        </w:rPr>
-      </w:r>
-      <w:r>
-        <w:rPr>
-          <w:rFonts w:hint="eastAsia"/>
-          <w:sz w:val="24"/>
-        </w:rPr>
-      </w:r>
-      <w:r>
-        <w:rPr>
-          <w:sz w:val="24"/>
-        </w:rPr>
-      </w:r>
-      <w:r>
-        <w:rPr>
-          <w:rFonts w:hint="eastAsia" w:ascii="宋体" w:hAnsi="宋体"/>
-          <w:sz w:val="24"/>
-        </w:rPr>
-      </w:r>
-      <w:r>
-        <w:rPr>
-          <w:rFonts w:ascii="宋体" w:hAnsi="宋体"/>
-          <w:sz w:val="24"/>
-        </w:rPr>
-      </w:r>
-      <w:r>
-        <w:rPr>
-          <w:rFonts w:hint="eastAsia" w:ascii="宋体" w:hAnsi="宋体"/>
-          <w:sz w:val="24"/>
-        </w:rPr>
-      </w:r>
-      <w:r>
-        <w:rPr>
-          <w:rFonts w:hint="eastAsia" w:ascii="宋体" w:hAnsi="宋体"/>
-          <w:color w:val="FF0000"/>
-          <w:sz w:val="24"/>
-        </w:rPr>
-      </w:r>
-      <w:r>
-        <w:rPr>
-          <w:rFonts w:hint="eastAsia" w:ascii="宋体" w:hAnsi="宋体"/>
-          <w:sz w:val="24"/>
-        </w:rPr>
-      </w:r>
-    </w:p>
-    <w:p>
-      <w:pPr>
-        <w:snapToGrid w:val="0"/>
-        <w:spacing w:line="400" w:lineRule="exact"/>
-        <w:ind w:firstLine="540" w:firstLineChars="225"/>
-        <w:rPr>
-          <w:rFonts w:ascii="宋体" w:hAnsi="宋体"/>
-          <w:sz w:val="24"/>
-        </w:rPr>
-      </w:pPr>
-    </w:p>
-    <w:p>
-      <w:pPr>
-        <w:snapToGrid w:val="0"/>
-        <w:spacing w:line="400" w:lineRule="exact"/>
-        <w:ind w:firstLine="540" w:firstLineChars="225"/>
-        <w:rPr>
-          <w:sz w:val="24"/>
-        </w:rPr>
-      </w:pPr>
-    </w:p>
-    <w:p>
-      <w:pPr>
-        <w:spacing w:line="400" w:lineRule="exact"/>
-        <w:jc w:val="left"/>
-        <w:rPr>
-          <w:rFonts w:ascii="楷体_GB2312" w:eastAsia="楷体_GB2312"/>
-          <w:sz w:val="24"/>
-        </w:rPr>
-      </w:pPr>
-      <w:r>
-        <w:rPr>
-          <w:b/>
-          <w:sz w:val="28"/>
-        </w:rPr>
-        <w:t xml:space="preserve">KEY WORDS: </w:t>
-      </w:r>
-      <w:r>
-        <w:rPr>
-          <w:rFonts w:ascii="宋体" w:hAnsi="宋体"/>
-          <w:sz w:val="24"/>
-        </w:rPr>
-        <w:t>{{ keywords_en }}</w:t>
-      </w:r>
-      <w:r>
-        <w:rPr>
-          <w:rFonts w:hint="eastAsia" w:ascii="宋体" w:hAnsi="宋体"/>
-          <w:color w:val="FF0000"/>
-          <w:sz w:val="24"/>
-          <w:lang w:val="en-US" w:eastAsia="zh-CN"/>
-        </w:rPr>
-      </w:r>
-      <w:r>
-        <w:rPr>
-          <w:rFonts w:ascii="宋体" w:hAnsi="宋体"/>
-          <w:sz w:val="24"/>
-        </w:rPr>
-      </w:r>
-      <w:r>
-        <w:rPr>
-          <w:rFonts w:hint="eastAsia" w:ascii="宋体" w:hAnsi="宋体"/>
-          <w:color w:val="FF0000"/>
-          <w:sz w:val="24"/>
-          <w:lang w:val="en-US" w:eastAsia="zh-CN"/>
-        </w:rPr>
-      </w:r>
-      <w:r>
-        <w:rPr>
-          <w:rFonts w:ascii="宋体" w:hAnsi="宋体"/>
-          <w:sz w:val="24"/>
-        </w:rPr>
-      </w:r>
-      <w:r>
-        <w:rPr>
-          <w:rFonts w:hint="eastAsia" w:ascii="宋体" w:hAnsi="宋体"/>
-          <w:color w:val="FF0000"/>
-          <w:sz w:val="24"/>
-          <w:lang w:val="en-US" w:eastAsia="zh-CN"/>
-        </w:rPr>
-      </w:r>
-      <w:r>
-        <w:rPr>
-          <w:rFonts w:ascii="宋体" w:hAnsi="宋体"/>
-          <w:sz w:val="24"/>
-        </w:rPr>
-      </w:r>
-    </w:p>
-    <w:p>
-      <w:pPr>
-        <w:spacing w:line="400" w:lineRule="exact"/>
-        <w:ind w:firstLine="480" w:firstLineChars="200"/>
-        <w:jc w:val="left"/>
-        <w:rPr>
-          <w:rFonts w:ascii="宋体" w:hAnsi="宋体"/>
-          <w:sz w:val="24"/>
-        </w:rPr>
-      </w:pPr>
-    </w:p>
-    <w:p>
-      <w:pPr>
-        <w:pStyle w:val="3"/>
-        <w:spacing w:before="480" w:after="360"/>
-        <w:sectPr>
-          <w:headerReference r:id="rId5" w:type="default"/>
-          <w:footerReference r:id="rId6" w:type="default"/>
-          <w:pgSz w:w="11906" w:h="16838"/>
-          <w:pgMar w:top="1134" w:right="1134" w:bottom="1134" w:left="1134" w:header="284" w:footer="284" w:gutter="284"/>
-          <w:pgNumType w:fmt="upperRoman" w:start="1"/>
-          <w:cols w:space="425" w:num="1"/>
-          <w:docGrid w:linePitch="312" w:charSpace="0"/>
-        </w:sectPr>
-      </w:pPr>
+          <w:rFonts w:hint="eastAsia"/>
+        </w:rPr>
+      </w:pPr>
+      <w:bookmarkStart w:id="5" w:name="_Toc55767849"/>
     </w:p>
     <w:p>
       <w:pPr>
@@ -2120,28 +2142,6 @@
         <w:spacing w:before="0" w:beforeLines="0" w:after="0" w:afterLines="0" w:line="360" w:lineRule="auto"/>
         <w:textAlignment w:val="auto"/>
         <w:rPr>
-          <w:rFonts w:hint="eastAsia"/>
-        </w:rPr>
-      </w:pPr>
-      <w:bookmarkStart w:id="5" w:name="_Toc55767849"/>
-    </w:p>
-    <w:p>
-      <w:pPr>
-        <w:pStyle w:val="3"/>
-        <w:pageBreakBefore w:val="0"/>
-        <w:widowControl w:val="0"/>
-        <w:kinsoku/>
-        <w:wordWrap/>
-        <w:overflowPunct/>
-        <w:topLinePunct w:val="0"/>
-        <w:autoSpaceDE/>
-        <w:autoSpaceDN/>
-        <w:bidi w:val="0"/>
-        <w:adjustRightInd/>
-        <w:snapToGrid/>
-        <w:spacing w:before="0" w:beforeLines="0" w:after="0" w:afterLines="0" w:line="360" w:lineRule="auto"/>
-        <w:textAlignment w:val="auto"/>
-        <w:rPr>
           <w:rFonts w:hint="eastAsia" w:eastAsia="黑体"/>
           <w:lang w:eastAsia="zh-CN"/>
         </w:rPr>
@@ -2181,7 +2181,6 @@
           <w:color w:val="FF0000"/>
           <w:lang w:eastAsia="zh-CN"/>
         </w:rPr>
-        <w:t>）</w:t>
       </w:r>
     </w:p>
     <w:p>

</xml_diff>

<commit_message>
fix: set Times New Roman for English text in JLAU template
- English abstract (p[21]): ascii/hAnsi font → Times New Roman
- KEY WORDS values (p[25]): ascii/hAnsi font → Times New Roman
- Body text paragraphs ({{ para }}, {{ p2 }}): ascii/hAnsi → Times New Roman
  Chinese text keeps 宋体, English/numbers render in Times New Roman

Co-Authored-By: Claude Opus 4.6 (1M context) <noreply@anthropic.com>
</commit_message>
<xml_diff>
--- a/templates/jlau/template.docx
+++ b/templates/jlau/template.docx
@@ -1891,13 +1891,13 @@
         <w:spacing w:line="400" w:lineRule="exact"/>
         <w:ind w:firstLine="540" w:firstLineChars="225"/>
         <w:rPr>
-          <w:rFonts w:ascii="宋体" w:hAnsi="宋体"/>
-          <w:sz w:val="24"/>
-        </w:rPr>
-      </w:pPr>
-      <w:r>
-        <w:rPr>
-          <w:rFonts w:hint="eastAsia" w:ascii="宋体" w:hAnsi="宋体"/>
+          <w:rFonts w:ascii="Times New Roman" w:hAnsi="Times New Roman"/>
+          <w:sz w:val="24"/>
+        </w:rPr>
+      </w:pPr>
+      <w:r>
+        <w:rPr>
+          <w:rFonts w:hint="eastAsia" w:ascii="Times New Roman" w:hAnsi="Times New Roman"/>
           <w:sz w:val="24"/>
         </w:rPr>
         <w:t>{{ abstract_en }}</w:t>
@@ -2016,7 +2016,7 @@
         <w:spacing w:line="400" w:lineRule="exact"/>
         <w:jc w:val="left"/>
         <w:rPr>
-          <w:rFonts w:ascii="楷体_GB2312" w:eastAsia="楷体_GB2312"/>
+          <w:rFonts w:ascii="Times New Roman" w:eastAsia="楷体_GB2312" w:hAnsi="Times New Roman"/>
           <w:sz w:val="24"/>
         </w:rPr>
       </w:pPr>
@@ -2029,14 +2029,14 @@
       </w:r>
       <w:r>
         <w:rPr>
-          <w:rFonts w:ascii="宋体" w:hAnsi="宋体"/>
+          <w:rFonts w:ascii="Times New Roman" w:hAnsi="Times New Roman"/>
           <w:sz w:val="24"/>
         </w:rPr>
         <w:t>{{ keywords_en }}</w:t>
       </w:r>
       <w:r>
         <w:rPr>
-          <w:rFonts w:hint="eastAsia" w:ascii="宋体" w:hAnsi="宋体"/>
+          <w:rFonts w:hint="eastAsia" w:ascii="Times New Roman" w:hAnsi="Times New Roman"/>
           <w:color w:val="FF0000"/>
           <w:sz w:val="24"/>
           <w:lang w:val="en-US" w:eastAsia="zh-CN"/>
@@ -2044,13 +2044,13 @@
       </w:r>
       <w:r>
         <w:rPr>
-          <w:rFonts w:ascii="宋体" w:hAnsi="宋体"/>
-          <w:sz w:val="24"/>
-        </w:rPr>
-      </w:r>
-      <w:r>
-        <w:rPr>
-          <w:rFonts w:hint="eastAsia" w:ascii="宋体" w:hAnsi="宋体"/>
+          <w:rFonts w:ascii="Times New Roman" w:hAnsi="Times New Roman"/>
+          <w:sz w:val="24"/>
+        </w:rPr>
+      </w:r>
+      <w:r>
+        <w:rPr>
+          <w:rFonts w:hint="eastAsia" w:ascii="Times New Roman" w:hAnsi="Times New Roman"/>
           <w:color w:val="FF0000"/>
           <w:sz w:val="24"/>
           <w:lang w:val="en-US" w:eastAsia="zh-CN"/>
@@ -2058,13 +2058,13 @@
       </w:r>
       <w:r>
         <w:rPr>
-          <w:rFonts w:ascii="宋体" w:hAnsi="宋体"/>
-          <w:sz w:val="24"/>
-        </w:rPr>
-      </w:r>
-      <w:r>
-        <w:rPr>
-          <w:rFonts w:hint="eastAsia" w:ascii="宋体" w:hAnsi="宋体"/>
+          <w:rFonts w:ascii="Times New Roman" w:hAnsi="Times New Roman"/>
+          <w:sz w:val="24"/>
+        </w:rPr>
+      </w:r>
+      <w:r>
+        <w:rPr>
+          <w:rFonts w:hint="eastAsia" w:ascii="Times New Roman" w:hAnsi="Times New Roman"/>
           <w:color w:val="FF0000"/>
           <w:sz w:val="24"/>
           <w:lang w:val="en-US" w:eastAsia="zh-CN"/>
@@ -2072,7 +2072,7 @@
       </w:r>
       <w:r>
         <w:rPr>
-          <w:rFonts w:ascii="宋体" w:hAnsi="宋体"/>
+          <w:rFonts w:ascii="Times New Roman" w:hAnsi="Times New Roman"/>
           <w:sz w:val="24"/>
         </w:rPr>
       </w:r>
@@ -8073,129 +8073,129 @@
         <w:spacing w:line="400" w:lineRule="exact"/>
         <w:ind w:firstLine="540" w:firstLineChars="225"/>
         <w:rPr>
-          <w:rFonts w:ascii="宋体" w:hAnsi="宋体"/>
-          <w:sz w:val="24"/>
-        </w:rPr>
-      </w:pPr>
-      <w:r>
-        <w:rPr>
-          <w:rFonts w:ascii="宋体" w:hAnsi="宋体"/>
+          <w:rFonts w:ascii="Times New Roman" w:hAnsi="Times New Roman"/>
+          <w:sz w:val="24"/>
+        </w:rPr>
+      </w:pPr>
+      <w:r>
+        <w:rPr>
+          <w:rFonts w:ascii="Times New Roman" w:hAnsi="Times New Roman"/>
           <w:sz w:val="24"/>
         </w:rPr>
         <w:t>{{ para }}</w:t>
       </w:r>
       <w:r>
         <w:rPr>
-          <w:rFonts w:hint="eastAsia" w:ascii="宋体" w:hAnsi="宋体"/>
-          <w:sz w:val="24"/>
-        </w:rPr>
-      </w:r>
-      <w:r>
-        <w:rPr>
-          <w:rFonts w:ascii="宋体" w:hAnsi="宋体"/>
-          <w:sz w:val="24"/>
-        </w:rPr>
-      </w:r>
-      <w:r>
-        <w:rPr>
-          <w:rFonts w:hint="eastAsia" w:ascii="宋体" w:hAnsi="宋体"/>
-          <w:sz w:val="24"/>
-        </w:rPr>
-      </w:r>
-      <w:r>
-        <w:rPr>
-          <w:rFonts w:ascii="宋体" w:hAnsi="宋体"/>
-          <w:sz w:val="24"/>
-        </w:rPr>
-      </w:r>
-      <w:r>
-        <w:rPr>
-          <w:rFonts w:ascii="宋体" w:hAnsi="宋体"/>
+          <w:rFonts w:hint="eastAsia" w:ascii="Times New Roman" w:hAnsi="Times New Roman"/>
+          <w:sz w:val="24"/>
+        </w:rPr>
+      </w:r>
+      <w:r>
+        <w:rPr>
+          <w:rFonts w:ascii="Times New Roman" w:hAnsi="Times New Roman"/>
+          <w:sz w:val="24"/>
+        </w:rPr>
+      </w:r>
+      <w:r>
+        <w:rPr>
+          <w:rFonts w:hint="eastAsia" w:ascii="Times New Roman" w:hAnsi="Times New Roman"/>
+          <w:sz w:val="24"/>
+        </w:rPr>
+      </w:r>
+      <w:r>
+        <w:rPr>
+          <w:rFonts w:ascii="Times New Roman" w:hAnsi="Times New Roman"/>
+          <w:sz w:val="24"/>
+        </w:rPr>
+      </w:r>
+      <w:r>
+        <w:rPr>
+          <w:rFonts w:ascii="Times New Roman" w:hAnsi="Times New Roman"/>
           <w:color w:val="FF0000"/>
           <w:sz w:val="24"/>
         </w:rPr>
       </w:r>
       <w:r>
         <w:rPr>
-          <w:rFonts w:ascii="宋体" w:hAnsi="宋体"/>
-          <w:sz w:val="24"/>
-        </w:rPr>
-      </w:r>
-      <w:r>
-        <w:rPr>
-          <w:rFonts w:ascii="宋体" w:hAnsi="宋体"/>
+          <w:rFonts w:ascii="Times New Roman" w:hAnsi="Times New Roman"/>
+          <w:sz w:val="24"/>
+        </w:rPr>
+      </w:r>
+      <w:r>
+        <w:rPr>
+          <w:rFonts w:ascii="Times New Roman" w:hAnsi="Times New Roman"/>
           <w:color w:val="FF0000"/>
           <w:sz w:val="24"/>
         </w:rPr>
       </w:r>
       <w:r>
         <w:rPr>
-          <w:rFonts w:ascii="宋体" w:hAnsi="宋体"/>
-          <w:sz w:val="24"/>
-        </w:rPr>
-      </w:r>
-      <w:r>
-        <w:rPr>
-          <w:rFonts w:ascii="宋体" w:hAnsi="宋体"/>
+          <w:rFonts w:ascii="Times New Roman" w:hAnsi="Times New Roman"/>
+          <w:sz w:val="24"/>
+        </w:rPr>
+      </w:r>
+      <w:r>
+        <w:rPr>
+          <w:rFonts w:ascii="Times New Roman" w:hAnsi="Times New Roman"/>
           <w:color w:val="FF0000"/>
           <w:sz w:val="24"/>
         </w:rPr>
       </w:r>
       <w:r>
         <w:rPr>
-          <w:rFonts w:ascii="宋体" w:hAnsi="宋体"/>
-          <w:sz w:val="24"/>
-        </w:rPr>
-      </w:r>
-      <w:r>
-        <w:rPr>
-          <w:rFonts w:ascii="宋体" w:hAnsi="宋体"/>
+          <w:rFonts w:ascii="Times New Roman" w:hAnsi="Times New Roman"/>
+          <w:sz w:val="24"/>
+        </w:rPr>
+      </w:r>
+      <w:r>
+        <w:rPr>
+          <w:rFonts w:ascii="Times New Roman" w:hAnsi="Times New Roman"/>
           <w:color w:val="FF0000"/>
           <w:sz w:val="24"/>
         </w:rPr>
       </w:r>
       <w:r>
         <w:rPr>
-          <w:rFonts w:ascii="宋体" w:hAnsi="宋体"/>
-          <w:sz w:val="24"/>
-        </w:rPr>
-      </w:r>
-      <w:r>
-        <w:rPr>
-          <w:rFonts w:ascii="宋体" w:hAnsi="宋体"/>
+          <w:rFonts w:ascii="Times New Roman" w:hAnsi="Times New Roman"/>
+          <w:sz w:val="24"/>
+        </w:rPr>
+      </w:r>
+      <w:r>
+        <w:rPr>
+          <w:rFonts w:ascii="Times New Roman" w:hAnsi="Times New Roman"/>
           <w:color w:val="FF0000"/>
           <w:sz w:val="24"/>
         </w:rPr>
       </w:r>
       <w:r>
         <w:rPr>
-          <w:rFonts w:ascii="宋体" w:hAnsi="宋体"/>
-          <w:sz w:val="24"/>
-        </w:rPr>
-      </w:r>
-      <w:r>
-        <w:rPr>
-          <w:rFonts w:hint="eastAsia" w:ascii="宋体" w:hAnsi="宋体"/>
-          <w:sz w:val="24"/>
-          <w:lang w:val="en-US" w:eastAsia="zh-CN"/>
-        </w:rPr>
-      </w:r>
-      <w:r>
-        <w:rPr>
-          <w:rFonts w:ascii="宋体" w:hAnsi="宋体"/>
-          <w:sz w:val="24"/>
-        </w:rPr>
-      </w:r>
-      <w:r>
-        <w:rPr>
-          <w:rFonts w:ascii="宋体" w:hAnsi="宋体"/>
+          <w:rFonts w:ascii="Times New Roman" w:hAnsi="Times New Roman"/>
+          <w:sz w:val="24"/>
+        </w:rPr>
+      </w:r>
+      <w:r>
+        <w:rPr>
+          <w:rFonts w:hint="eastAsia" w:ascii="Times New Roman" w:hAnsi="Times New Roman"/>
+          <w:sz w:val="24"/>
+          <w:lang w:val="en-US" w:eastAsia="zh-CN"/>
+        </w:rPr>
+      </w:r>
+      <w:r>
+        <w:rPr>
+          <w:rFonts w:ascii="Times New Roman" w:hAnsi="Times New Roman"/>
+          <w:sz w:val="24"/>
+        </w:rPr>
+      </w:r>
+      <w:r>
+        <w:rPr>
+          <w:rFonts w:ascii="Times New Roman" w:hAnsi="Times New Roman"/>
           <w:color w:val="FF0000"/>
           <w:sz w:val="24"/>
         </w:rPr>
       </w:r>
       <w:r>
         <w:rPr>
-          <w:rFonts w:ascii="宋体" w:hAnsi="宋体"/>
+          <w:rFonts w:ascii="Times New Roman" w:hAnsi="Times New Roman"/>
           <w:sz w:val="24"/>
         </w:rPr>
       </w:r>
@@ -8235,129 +8235,129 @@
         <w:spacing w:line="400" w:lineRule="exact"/>
         <w:ind w:firstLine="540" w:firstLineChars="225"/>
         <w:rPr>
-          <w:rFonts w:ascii="宋体" w:hAnsi="宋体"/>
-          <w:sz w:val="24"/>
-        </w:rPr>
-      </w:pPr>
-      <w:r>
-        <w:rPr>
-          <w:rFonts w:ascii="宋体" w:hAnsi="宋体"/>
+          <w:rFonts w:ascii="Times New Roman" w:hAnsi="Times New Roman"/>
+          <w:sz w:val="24"/>
+        </w:rPr>
+      </w:pPr>
+      <w:r>
+        <w:rPr>
+          <w:rFonts w:ascii="Times New Roman" w:hAnsi="Times New Roman"/>
           <w:sz w:val="24"/>
         </w:rPr>
         <w:t>{{ p2 }}</w:t>
       </w:r>
       <w:r>
         <w:rPr>
-          <w:rFonts w:hint="eastAsia" w:ascii="宋体" w:hAnsi="宋体"/>
-          <w:sz w:val="24"/>
-        </w:rPr>
-      </w:r>
-      <w:r>
-        <w:rPr>
-          <w:rFonts w:ascii="宋体" w:hAnsi="宋体"/>
-          <w:sz w:val="24"/>
-        </w:rPr>
-      </w:r>
-      <w:r>
-        <w:rPr>
-          <w:rFonts w:hint="eastAsia" w:ascii="宋体" w:hAnsi="宋体"/>
-          <w:sz w:val="24"/>
-        </w:rPr>
-      </w:r>
-      <w:r>
-        <w:rPr>
-          <w:rFonts w:ascii="宋体" w:hAnsi="宋体"/>
-          <w:sz w:val="24"/>
-        </w:rPr>
-      </w:r>
-      <w:r>
-        <w:rPr>
-          <w:rFonts w:ascii="宋体" w:hAnsi="宋体"/>
+          <w:rFonts w:hint="eastAsia" w:ascii="Times New Roman" w:hAnsi="Times New Roman"/>
+          <w:sz w:val="24"/>
+        </w:rPr>
+      </w:r>
+      <w:r>
+        <w:rPr>
+          <w:rFonts w:ascii="Times New Roman" w:hAnsi="Times New Roman"/>
+          <w:sz w:val="24"/>
+        </w:rPr>
+      </w:r>
+      <w:r>
+        <w:rPr>
+          <w:rFonts w:hint="eastAsia" w:ascii="Times New Roman" w:hAnsi="Times New Roman"/>
+          <w:sz w:val="24"/>
+        </w:rPr>
+      </w:r>
+      <w:r>
+        <w:rPr>
+          <w:rFonts w:ascii="Times New Roman" w:hAnsi="Times New Roman"/>
+          <w:sz w:val="24"/>
+        </w:rPr>
+      </w:r>
+      <w:r>
+        <w:rPr>
+          <w:rFonts w:ascii="Times New Roman" w:hAnsi="Times New Roman"/>
           <w:color w:val="FF0000"/>
           <w:sz w:val="24"/>
         </w:rPr>
       </w:r>
       <w:r>
         <w:rPr>
-          <w:rFonts w:ascii="宋体" w:hAnsi="宋体"/>
-          <w:sz w:val="24"/>
-        </w:rPr>
-      </w:r>
-      <w:r>
-        <w:rPr>
-          <w:rFonts w:ascii="宋体" w:hAnsi="宋体"/>
+          <w:rFonts w:ascii="Times New Roman" w:hAnsi="Times New Roman"/>
+          <w:sz w:val="24"/>
+        </w:rPr>
+      </w:r>
+      <w:r>
+        <w:rPr>
+          <w:rFonts w:ascii="Times New Roman" w:hAnsi="Times New Roman"/>
           <w:color w:val="FF0000"/>
           <w:sz w:val="24"/>
         </w:rPr>
       </w:r>
       <w:r>
         <w:rPr>
-          <w:rFonts w:ascii="宋体" w:hAnsi="宋体"/>
-          <w:sz w:val="24"/>
-        </w:rPr>
-      </w:r>
-      <w:r>
-        <w:rPr>
-          <w:rFonts w:ascii="宋体" w:hAnsi="宋体"/>
+          <w:rFonts w:ascii="Times New Roman" w:hAnsi="Times New Roman"/>
+          <w:sz w:val="24"/>
+        </w:rPr>
+      </w:r>
+      <w:r>
+        <w:rPr>
+          <w:rFonts w:ascii="Times New Roman" w:hAnsi="Times New Roman"/>
           <w:color w:val="FF0000"/>
           <w:sz w:val="24"/>
         </w:rPr>
       </w:r>
       <w:r>
         <w:rPr>
-          <w:rFonts w:ascii="宋体" w:hAnsi="宋体"/>
-          <w:sz w:val="24"/>
-        </w:rPr>
-      </w:r>
-      <w:r>
-        <w:rPr>
-          <w:rFonts w:ascii="宋体" w:hAnsi="宋体"/>
+          <w:rFonts w:ascii="Times New Roman" w:hAnsi="Times New Roman"/>
+          <w:sz w:val="24"/>
+        </w:rPr>
+      </w:r>
+      <w:r>
+        <w:rPr>
+          <w:rFonts w:ascii="Times New Roman" w:hAnsi="Times New Roman"/>
           <w:color w:val="FF0000"/>
           <w:sz w:val="24"/>
         </w:rPr>
       </w:r>
       <w:r>
         <w:rPr>
-          <w:rFonts w:ascii="宋体" w:hAnsi="宋体"/>
-          <w:sz w:val="24"/>
-        </w:rPr>
-      </w:r>
-      <w:r>
-        <w:rPr>
-          <w:rFonts w:ascii="宋体" w:hAnsi="宋体"/>
+          <w:rFonts w:ascii="Times New Roman" w:hAnsi="Times New Roman"/>
+          <w:sz w:val="24"/>
+        </w:rPr>
+      </w:r>
+      <w:r>
+        <w:rPr>
+          <w:rFonts w:ascii="Times New Roman" w:hAnsi="Times New Roman"/>
           <w:color w:val="FF0000"/>
           <w:sz w:val="24"/>
         </w:rPr>
       </w:r>
       <w:r>
         <w:rPr>
-          <w:rFonts w:ascii="宋体" w:hAnsi="宋体"/>
-          <w:sz w:val="24"/>
-        </w:rPr>
-      </w:r>
-      <w:r>
-        <w:rPr>
-          <w:rFonts w:hint="eastAsia" w:ascii="宋体" w:hAnsi="宋体"/>
-          <w:sz w:val="24"/>
-          <w:lang w:val="en-US" w:eastAsia="zh-CN"/>
-        </w:rPr>
-      </w:r>
-      <w:r>
-        <w:rPr>
-          <w:rFonts w:ascii="宋体" w:hAnsi="宋体"/>
-          <w:sz w:val="24"/>
-        </w:rPr>
-      </w:r>
-      <w:r>
-        <w:rPr>
-          <w:rFonts w:ascii="宋体" w:hAnsi="宋体"/>
+          <w:rFonts w:ascii="Times New Roman" w:hAnsi="Times New Roman"/>
+          <w:sz w:val="24"/>
+        </w:rPr>
+      </w:r>
+      <w:r>
+        <w:rPr>
+          <w:rFonts w:hint="eastAsia" w:ascii="Times New Roman" w:hAnsi="Times New Roman"/>
+          <w:sz w:val="24"/>
+          <w:lang w:val="en-US" w:eastAsia="zh-CN"/>
+        </w:rPr>
+      </w:r>
+      <w:r>
+        <w:rPr>
+          <w:rFonts w:ascii="Times New Roman" w:hAnsi="Times New Roman"/>
+          <w:sz w:val="24"/>
+        </w:rPr>
+      </w:r>
+      <w:r>
+        <w:rPr>
+          <w:rFonts w:ascii="Times New Roman" w:hAnsi="Times New Roman"/>
           <w:color w:val="FF0000"/>
           <w:sz w:val="24"/>
         </w:rPr>
       </w:r>
       <w:r>
         <w:rPr>
-          <w:rFonts w:ascii="宋体" w:hAnsi="宋体"/>
+          <w:rFonts w:ascii="Times New Roman" w:hAnsi="Times New Roman"/>
           <w:sz w:val="24"/>
         </w:rPr>
       </w:r>

</xml_diff>

<commit_message>
fix: acknowledgement overwriting 致谢 heading title
Step 7 was replacing the Heading 1 paragraph (致  谢) itself with
{{ acknowledgement }} because all Normal paragraphs after it were empty
(cleared by Step 5). Fix: skip Heading paragraphs, write to the first
Normal paragraph after the title.

Co-Authored-By: Claude Opus 4.6 (1M context) <noreply@anthropic.com>
</commit_message>
<xml_diff>
--- a/templates/jlau/template.docx
+++ b/templates/jlau/template.docx
@@ -12049,17 +12049,24 @@
         <w:rPr>
           <w:rFonts w:hint="eastAsia"/>
         </w:rPr>
+        <w:t xml:space="preserve">致 </w:t>
+      </w:r>
+      <w:r>
+        <w:t xml:space="preserve"> </w:t>
+      </w:r>
+      <w:r>
+        <w:rPr>
+          <w:rFonts w:hint="eastAsia"/>
+        </w:rPr>
+        <w:t>谢</w:t>
+      </w:r>
+      <w:bookmarkEnd w:id="12"/>
+    </w:p>
+    <w:p>
+      <w:r>
         <w:t xml:space="preserve">    {{ acknowledgement }}</w:t>
       </w:r>
-      <w:r/>
-      <w:r>
-        <w:rPr>
-          <w:rFonts w:hint="eastAsia"/>
-        </w:rPr>
-      </w:r>
-      <w:bookmarkEnd w:id="12"/>
-    </w:p>
-    <w:p/>
+    </w:p>
     <w:p>
       <w:pPr>
         <w:snapToGrid w:val="0"/>

</xml_diff>